<commit_message>
Refactor: migração para PHP, gamificação RPG e correção de paths
- home.php: nova estrutura com hero/CTA, cards dos anos no topo,
  meta tags de SEO (Open Graph, Twitter Card) e card de desemprego
  no Monitor Brasil
- includes/header.php e footer.php: header/footer convertidos em
  PHP includes (ano automático no copyright)
- js/duvid-cache.js: detector automático de DUVID_BASE para
  fetches funcionarem em qualquer profundidade de página
- js/carregar.js: fetch do header/footer agora aponta para .php,
  com resolver de imagens via data-base-src
- js/duvid-ui.js, jstextos-padrao.js, jsquestoes-padrao.js,
  duvid-core.js: paths absolutos substituídos por chamadas que
  passam pelo duvidUrl()
- Selic atualizada para série 432 (Meta COPOM em vez de efetiva)
- Projeto movido para a raiz do XAMPP (htdocs/) para paridade
  com produção
</commit_message>
<xml_diff>
--- a/rotinas/DocumentacaoSite.docx
+++ b/rotinas/DocumentacaoSite.docx
@@ -23,6 +23,20 @@
           <w:szCs w:val="40"/>
         </w:rPr>
         <w:t xml:space="preserve">Documentação site </w:t>
+      </w:r>
+      <w:r>
+        <w:rPr>
+          <w:sz w:val="40"/>
+          <w:szCs w:val="40"/>
+        </w:rPr>
+        <w:t>em php:</w:t>
+      </w:r>
+      <w:r>
+        <w:rPr>
+          <w:sz w:val="40"/>
+          <w:szCs w:val="40"/>
+        </w:rPr>
+        <w:t xml:space="preserve"> </w:t>
       </w:r>
       <w:hyperlink r:id="rId2">
         <w:r>
@@ -76,26 +90,27 @@
           </w:r>
           <w:r>
             <w:rPr>
-              <w:rStyle w:val="Vnculodendice"/>
+              <w:rStyle w:val="Vnculodendiceuser"/>
             </w:rPr>
             <w:instrText xml:space="preserve"> TOC \f \o "1-9" \h</w:instrText>
           </w:r>
           <w:r>
             <w:rPr>
-              <w:rStyle w:val="Vnculodendice"/>
+              <w:rStyle w:val="Vnculodendiceuser"/>
             </w:rPr>
             <w:fldChar w:fldCharType="separate"/>
           </w:r>
-          <w:hyperlink w:anchor="__RefHeading___Toc1411_3853039510" w:tooltip="Resumo site duvid">
-            <w:r>
-              <w:rPr>
-                <w:rStyle w:val="Vnculodendice"/>
-              </w:rPr>
-              <w:t>Resumo site duvid</w:t>
-              <w:tab/>
-              <w:t>4</w:t>
-            </w:r>
-          </w:hyperlink>
+          <w:r>
+            <w:rPr>
+              <w:rStyle w:val="Vnculodendiceuser"/>
+            </w:rPr>
+            <w:t>Resumo site duvid</w:t>
+          </w:r>
+          <w:r>
+            <w:rPr/>
+            <w:tab/>
+            <w:t>4</w:t>
+          </w:r>
         </w:p>
         <w:p>
           <w:pPr>
@@ -106,16 +121,12 @@
             </w:tabs>
             <w:rPr/>
           </w:pPr>
-          <w:hyperlink w:anchor="__RefHeading___Toc1554_2479898416" w:tooltip="1. Arquivos do Núcleo (Core)">
-            <w:r>
-              <w:rPr>
-                <w:rStyle w:val="Vnculodendice"/>
-              </w:rPr>
-              <w:t>1. Arquivos do Núcleo (Core)</w:t>
-              <w:tab/>
-              <w:t>5</w:t>
-            </w:r>
-          </w:hyperlink>
+          <w:r>
+            <w:rPr/>
+            <w:t>1. Arquivos do Núcleo (Core)</w:t>
+            <w:tab/>
+            <w:t>5</w:t>
+          </w:r>
         </w:p>
         <w:p>
           <w:pPr>
@@ -126,22 +137,16 @@
             </w:tabs>
             <w:rPr/>
           </w:pPr>
-          <w:hyperlink w:anchor="__RefHeading___Toc1556_2479898416" w:tooltip="✍️ 2. Arquivos do Blog (Estrutura de Conteúdo)">
-            <w:r>
-              <w:rPr>
-                <w:rStyle w:val="Vnculodendice"/>
-              </w:rPr>
-              <w:t xml:space="preserve">✍️ </w:t>
-            </w:r>
-            <w:r>
-              <w:rPr>
-                <w:rStyle w:val="Vnculodendice"/>
-              </w:rPr>
-              <w:t>2. Arquivos do Blog (Estrutura de Conteúdo)</w:t>
-              <w:tab/>
-              <w:t>5</w:t>
-            </w:r>
-          </w:hyperlink>
+          <w:r>
+            <w:rPr/>
+            <w:t xml:space="preserve">✍️ </w:t>
+          </w:r>
+          <w:r>
+            <w:rPr/>
+            <w:t>2. Arquivos do Blog (Estrutura de Conteúdo)</w:t>
+            <w:tab/>
+            <w:t>5</w:t>
+          </w:r>
         </w:p>
         <w:p>
           <w:pPr>
@@ -152,22 +157,16 @@
             </w:tabs>
             <w:rPr/>
           </w:pPr>
-          <w:hyperlink w:anchor="__RefHeading___Toc1558_2479898416" w:tooltip="🗺️ 3. Mapa de Ativos (Assets)">
-            <w:r>
-              <w:rPr>
-                <w:rStyle w:val="Vnculodendice"/>
-              </w:rPr>
-              <w:t xml:space="preserve">🗺️ </w:t>
-            </w:r>
-            <w:r>
-              <w:rPr>
-                <w:rStyle w:val="Vnculodendice"/>
-              </w:rPr>
-              <w:t>3. Mapa de Ativos (Assets)</w:t>
-              <w:tab/>
-              <w:t>6</w:t>
-            </w:r>
-          </w:hyperlink>
+          <w:r>
+            <w:rPr/>
+            <w:t xml:space="preserve">🗺️ </w:t>
+          </w:r>
+          <w:r>
+            <w:rPr/>
+            <w:t>3. Mapa de Ativos (Assets)</w:t>
+            <w:tab/>
+            <w:t>6</w:t>
+          </w:r>
         </w:p>
         <w:p>
           <w:pPr>
@@ -178,22 +177,16 @@
             </w:tabs>
             <w:rPr/>
           </w:pPr>
-          <w:hyperlink w:anchor="__RefHeading___Toc1560_2479898416" w:tooltip="🕵️ Destaque Técnico: O Fluxo de Dados">
-            <w:r>
-              <w:rPr>
-                <w:rStyle w:val="Vnculodendice"/>
-              </w:rPr>
-              <w:t xml:space="preserve">🕵️ </w:t>
-            </w:r>
-            <w:r>
-              <w:rPr>
-                <w:rStyle w:val="Vnculodendice"/>
-              </w:rPr>
-              <w:t>Destaque Técnico: O Fluxo de Dados</w:t>
-              <w:tab/>
-              <w:t>6</w:t>
-            </w:r>
-          </w:hyperlink>
+          <w:r>
+            <w:rPr/>
+            <w:t xml:space="preserve">🕵️ </w:t>
+          </w:r>
+          <w:r>
+            <w:rPr/>
+            <w:t>Destaque Técnico: O Fluxo de Dados</w:t>
+            <w:tab/>
+            <w:t>6</w:t>
+          </w:r>
         </w:p>
         <w:p>
           <w:pPr>
@@ -204,16 +197,12 @@
             </w:tabs>
             <w:rPr/>
           </w:pPr>
-          <w:hyperlink w:anchor="__RefHeading___Toc1297_1126582209" w:tooltip="Sistema Duvid Geografia: Guia de Arquitetura">
-            <w:r>
-              <w:rPr>
-                <w:rStyle w:val="Vnculodendice"/>
-              </w:rPr>
-              <w:t>Sistema Duvid Geografia: Guia de Arquitetura</w:t>
-              <w:tab/>
-              <w:t>7</w:t>
-            </w:r>
-          </w:hyperlink>
+          <w:r>
+            <w:rPr/>
+            <w:t>Sistema Duvid Geografia: Guia de Arquitetura</w:t>
+            <w:tab/>
+            <w:t>7</w:t>
+          </w:r>
         </w:p>
         <w:p>
           <w:pPr>
@@ -224,22 +213,16 @@
             </w:tabs>
             <w:rPr/>
           </w:pPr>
-          <w:hyperlink w:anchor="__RefHeading___Toc1299_1126582209" w:tooltip="🏗️ 1. Core &amp; Banco de Dados (Os Motores)">
-            <w:r>
-              <w:rPr>
-                <w:rStyle w:val="Vnculodendice"/>
-              </w:rPr>
-              <w:t xml:space="preserve">🏗️ </w:t>
-            </w:r>
-            <w:r>
-              <w:rPr>
-                <w:rStyle w:val="Vnculodendice"/>
-              </w:rPr>
-              <w:t>1. Core &amp; Banco de Dados (Os Motores)</w:t>
-              <w:tab/>
-              <w:t>7</w:t>
-            </w:r>
-          </w:hyperlink>
+          <w:r>
+            <w:rPr/>
+            <w:t xml:space="preserve">🏗️ </w:t>
+          </w:r>
+          <w:r>
+            <w:rPr/>
+            <w:t>1. Core &amp; Banco de Dados (Os Motores)</w:t>
+            <w:tab/>
+            <w:t>7</w:t>
+          </w:r>
         </w:p>
         <w:p>
           <w:pPr>
@@ -250,22 +233,16 @@
             </w:tabs>
             <w:rPr/>
           </w:pPr>
-          <w:hyperlink w:anchor="__RefHeading___Toc1301_1126582209" w:tooltip="🎨 2. Interface &amp; Áudio (Os Sentidos)">
-            <w:r>
-              <w:rPr>
-                <w:rStyle w:val="Vnculodendice"/>
-              </w:rPr>
-              <w:t xml:space="preserve">🎨 </w:t>
-            </w:r>
-            <w:r>
-              <w:rPr>
-                <w:rStyle w:val="Vnculodendice"/>
-              </w:rPr>
-              <w:t>2. Interface &amp; Áudio (Os Sentidos)</w:t>
-              <w:tab/>
-              <w:t>7</w:t>
-            </w:r>
-          </w:hyperlink>
+          <w:r>
+            <w:rPr/>
+            <w:t xml:space="preserve">🎨 </w:t>
+          </w:r>
+          <w:r>
+            <w:rPr/>
+            <w:t>2. Interface &amp; Áudio (Os Sentidos)</w:t>
+            <w:tab/>
+            <w:t>7</w:t>
+          </w:r>
         </w:p>
         <w:p>
           <w:pPr>
@@ -276,22 +253,16 @@
             </w:tabs>
             <w:rPr/>
           </w:pPr>
-          <w:hyperlink w:anchor="__RefHeading___Toc1303_1126582209" w:tooltip="📖 3. Lógica de Conteúdo (As Engrenagens)">
-            <w:r>
-              <w:rPr>
-                <w:rStyle w:val="Vnculodendice"/>
-              </w:rPr>
-              <w:t xml:space="preserve">📖 </w:t>
-            </w:r>
-            <w:r>
-              <w:rPr>
-                <w:rStyle w:val="Vnculodendice"/>
-              </w:rPr>
-              <w:t>3. Lógica de Conteúdo (As Engrenagens)</w:t>
-              <w:tab/>
-              <w:t>8</w:t>
-            </w:r>
-          </w:hyperlink>
+          <w:r>
+            <w:rPr/>
+            <w:t xml:space="preserve">📖 </w:t>
+          </w:r>
+          <w:r>
+            <w:rPr/>
+            <w:t>3. Lógica de Conteúdo (As Engrenagens)</w:t>
+            <w:tab/>
+            <w:t>8</w:t>
+          </w:r>
         </w:p>
         <w:p>
           <w:pPr>
@@ -302,22 +273,16 @@
             </w:tabs>
             <w:rPr/>
           </w:pPr>
-          <w:hyperlink w:anchor="__RefHeading___Toc1305_1126582209" w:tooltip="🛠️ 4. Fluxo de Trabalho Sênior (Clean Code)">
-            <w:r>
-              <w:rPr>
-                <w:rStyle w:val="Vnculodendice"/>
-              </w:rPr>
-              <w:t xml:space="preserve">🛠️ </w:t>
-            </w:r>
-            <w:r>
-              <w:rPr>
-                <w:rStyle w:val="Vnculodendice"/>
-              </w:rPr>
-              <w:t>4. Fluxo de Trabalho Sênior (Clean Code)</w:t>
-              <w:tab/>
-              <w:t>8</w:t>
-            </w:r>
-          </w:hyperlink>
+          <w:r>
+            <w:rPr/>
+            <w:t xml:space="preserve">🛠️ </w:t>
+          </w:r>
+          <w:r>
+            <w:rPr/>
+            <w:t>4. Fluxo de Trabalho Sênior (Clean Code)</w:t>
+            <w:tab/>
+            <w:t>8</w:t>
+          </w:r>
         </w:p>
         <w:p>
           <w:pPr>
@@ -328,22 +293,16 @@
             </w:tabs>
             <w:rPr/>
           </w:pPr>
-          <w:hyperlink w:anchor="__RefHeading___Toc1307_1126582209" w:tooltip="💡 Status Atual do Projeto">
-            <w:r>
-              <w:rPr>
-                <w:rStyle w:val="Vnculodendice"/>
-              </w:rPr>
-              <w:t xml:space="preserve">💡 </w:t>
-            </w:r>
-            <w:r>
-              <w:rPr>
-                <w:rStyle w:val="Vnculodendice"/>
-              </w:rPr>
-              <w:t>Status Atual do Projeto</w:t>
-              <w:tab/>
-              <w:t>8</w:t>
-            </w:r>
-          </w:hyperlink>
+          <w:r>
+            <w:rPr/>
+            <w:t xml:space="preserve">💡 </w:t>
+          </w:r>
+          <w:r>
+            <w:rPr/>
+            <w:t>Status Atual do Projeto</w:t>
+            <w:tab/>
+            <w:t>8</w:t>
+          </w:r>
         </w:p>
         <w:p>
           <w:pPr>
@@ -354,16 +313,12 @@
             </w:tabs>
             <w:rPr/>
           </w:pPr>
-          <w:hyperlink w:anchor="__RefHeading___Toc1309_1126582209" w:tooltip="5. Módulo do Blog (Atualidade e Conteúdo)">
-            <w:r>
-              <w:rPr>
-                <w:rStyle w:val="Vnculodendice"/>
-              </w:rPr>
-              <w:t>5. Módulo do Blog (Atualidade e Conteúdo)</w:t>
-              <w:tab/>
-              <w:t>9</w:t>
-            </w:r>
-          </w:hyperlink>
+          <w:r>
+            <w:rPr/>
+            <w:t>5. Módulo do Blog (Atualidade e Conteúdo)</w:t>
+            <w:tab/>
+            <w:t>9</w:t>
+          </w:r>
         </w:p>
         <w:p>
           <w:pPr>
@@ -374,16 +329,12 @@
             </w:tabs>
             <w:rPr/>
           </w:pPr>
-          <w:hyperlink w:anchor="__RefHeading___Toc13_3754114533" w:tooltip="Javascript">
-            <w:r>
-              <w:rPr>
-                <w:rStyle w:val="Vnculodendice"/>
-              </w:rPr>
-              <w:t>Javascript</w:t>
-              <w:tab/>
-              <w:t>9</w:t>
-            </w:r>
-          </w:hyperlink>
+          <w:r>
+            <w:rPr/>
+            <w:t>Javascript</w:t>
+            <w:tab/>
+            <w:t>9</w:t>
+          </w:r>
         </w:p>
         <w:p>
           <w:pPr>
@@ -394,16 +345,12 @@
             </w:tabs>
             <w:rPr/>
           </w:pPr>
-          <w:hyperlink w:anchor="__RefHeading___Toc20_3754114533" w:tooltip="jstextos-padrao.sj">
-            <w:r>
-              <w:rPr>
-                <w:rStyle w:val="Vnculodendice"/>
-              </w:rPr>
-              <w:t>jstextos-padrao.sj</w:t>
-              <w:tab/>
-              <w:t>9</w:t>
-            </w:r>
-          </w:hyperlink>
+          <w:r>
+            <w:rPr/>
+            <w:t>jstextos-padrao.sj</w:t>
+            <w:tab/>
+            <w:t>9</w:t>
+          </w:r>
         </w:p>
         <w:p>
           <w:pPr>
@@ -414,16 +361,12 @@
             </w:tabs>
             <w:rPr/>
           </w:pPr>
-          <w:hyperlink w:anchor="__RefHeading___Toc22_3754114533" w:tooltip="1. Gestão de Identidade e Sessão">
-            <w:r>
-              <w:rPr>
-                <w:rStyle w:val="Vnculodendice"/>
-              </w:rPr>
-              <w:t>1. Gestão de Identidade e Sessão</w:t>
-              <w:tab/>
-              <w:t>9</w:t>
-            </w:r>
-          </w:hyperlink>
+          <w:r>
+            <w:rPr/>
+            <w:t>1. Gestão de Identidade e Sessão</w:t>
+            <w:tab/>
+            <w:t>9</w:t>
+          </w:r>
         </w:p>
         <w:p>
           <w:pPr>
@@ -434,16 +377,12 @@
             </w:tabs>
             <w:rPr/>
           </w:pPr>
-          <w:hyperlink w:anchor="__RefHeading___Toc24_3754114533" w:tooltip="2. Motor de Gamificação e Feedback">
-            <w:r>
-              <w:rPr>
-                <w:rStyle w:val="Vnculodendice"/>
-              </w:rPr>
-              <w:t>2. Motor de Gamificação e Feedback</w:t>
-              <w:tab/>
-              <w:t>10</w:t>
-            </w:r>
-          </w:hyperlink>
+          <w:r>
+            <w:rPr/>
+            <w:t>2. Motor de Gamificação e Feedback</w:t>
+            <w:tab/>
+            <w:t>10</w:t>
+          </w:r>
         </w:p>
         <w:p>
           <w:pPr>
@@ -454,16 +393,12 @@
             </w:tabs>
             <w:rPr/>
           </w:pPr>
-          <w:hyperlink w:anchor="__RefHeading___Toc26_3754114533" w:tooltip="3. Controle de Navegação e Progresso Interno">
-            <w:r>
-              <w:rPr>
-                <w:rStyle w:val="Vnculodendice"/>
-              </w:rPr>
-              <w:t>3. Controle de Navegação e Progresso Interno</w:t>
-              <w:tab/>
-              <w:t>10</w:t>
-            </w:r>
-          </w:hyperlink>
+          <w:r>
+            <w:rPr/>
+            <w:t>3. Controle de Navegação e Progresso Interno</w:t>
+            <w:tab/>
+            <w:t>10</w:t>
+          </w:r>
         </w:p>
         <w:p>
           <w:pPr>
@@ -474,16 +409,12 @@
             </w:tabs>
             <w:rPr/>
           </w:pPr>
-          <w:hyperlink w:anchor="__RefHeading___Toc28_3754114533" w:tooltip="4. Finalização e &quot;Congelamento&quot; da Aula">
-            <w:r>
-              <w:rPr>
-                <w:rStyle w:val="Vnculodendice"/>
-              </w:rPr>
-              <w:t>4. Finalização e "Congelamento" da Aula</w:t>
-              <w:tab/>
-              <w:t>10</w:t>
-            </w:r>
-          </w:hyperlink>
+          <w:r>
+            <w:rPr/>
+            <w:t>4. Finalização e "Congelamento" da Aula</w:t>
+            <w:tab/>
+            <w:t>10</w:t>
+          </w:r>
         </w:p>
         <w:p>
           <w:pPr>
@@ -494,16 +425,12 @@
             </w:tabs>
             <w:rPr/>
           </w:pPr>
-          <w:hyperlink w:anchor="__RefHeading___Toc30_3754114533" w:tooltip="Observação Técnica para sua Documentação:">
-            <w:r>
-              <w:rPr>
-                <w:rStyle w:val="Vnculodendice"/>
-              </w:rPr>
-              <w:t>Observação Técnica para sua Documentação:</w:t>
-              <w:tab/>
-              <w:t>11</w:t>
-            </w:r>
-          </w:hyperlink>
+          <w:r>
+            <w:rPr/>
+            <w:t>Observação Técnica para sua Documentação:</w:t>
+            <w:tab/>
+            <w:t>11</w:t>
+          </w:r>
         </w:p>
         <w:p>
           <w:pPr>
@@ -514,16 +441,12 @@
             </w:tabs>
             <w:rPr/>
           </w:pPr>
-          <w:hyperlink w:anchor="__RefHeading___Toc690_3754114533" w:tooltip="aulas-geral.js">
-            <w:r>
-              <w:rPr>
-                <w:rStyle w:val="Vnculodendice"/>
-              </w:rPr>
-              <w:t>aulas-geral.js</w:t>
-              <w:tab/>
-              <w:t>11</w:t>
-            </w:r>
-          </w:hyperlink>
+          <w:r>
+            <w:rPr/>
+            <w:t>aulas-geral.js</w:t>
+            <w:tab/>
+            <w:t>11</w:t>
+          </w:r>
         </w:p>
         <w:p>
           <w:pPr>
@@ -534,16 +457,12 @@
             </w:tabs>
             <w:rPr/>
           </w:pPr>
-          <w:hyperlink w:anchor="__RefHeading___Toc103_3754114533" w:tooltip="1. Carregamento e Renderização de Dados (JSON)">
-            <w:r>
-              <w:rPr>
-                <w:rStyle w:val="Vnculodendice"/>
-              </w:rPr>
-              <w:t>1. Carregamento e Renderização de Dados (JSON)</w:t>
-              <w:tab/>
-              <w:t>11</w:t>
-            </w:r>
-          </w:hyperlink>
+          <w:r>
+            <w:rPr/>
+            <w:t>1. Carregamento e Renderização de Dados (JSON)</w:t>
+            <w:tab/>
+            <w:t>11</w:t>
+          </w:r>
         </w:p>
         <w:p>
           <w:pPr>
@@ -554,16 +473,12 @@
             </w:tabs>
             <w:rPr/>
           </w:pPr>
-          <w:hyperlink w:anchor="__RefHeading___Toc105_3754114533" w:tooltip="2. Painel de Experiência do Usuário (Boas-vindas)">
-            <w:r>
-              <w:rPr>
-                <w:rStyle w:val="Vnculodendice"/>
-              </w:rPr>
-              <w:t>2. Painel de Experiência do Usuário (Boas-vindas)</w:t>
-              <w:tab/>
-              <w:t>11</w:t>
-            </w:r>
-          </w:hyperlink>
+          <w:r>
+            <w:rPr/>
+            <w:t>2. Painel de Experiência do Usuário (Boas-vindas)</w:t>
+            <w:tab/>
+            <w:t>11</w:t>
+          </w:r>
         </w:p>
         <w:p>
           <w:pPr>
@@ -574,16 +489,12 @@
             </w:tabs>
             <w:rPr/>
           </w:pPr>
-          <w:hyperlink w:anchor="__RefHeading___Toc107_3754114533" w:tooltip="3. Sistema de Conquistas e Gamificação Global">
-            <w:r>
-              <w:rPr>
-                <w:rStyle w:val="Vnculodendice"/>
-              </w:rPr>
-              <w:t>3. Sistema de Conquistas e Gamificação Global</w:t>
-              <w:tab/>
-              <w:t>12</w:t>
-            </w:r>
-          </w:hyperlink>
+          <w:r>
+            <w:rPr/>
+            <w:t>3. Sistema de Conquistas e Gamificação Global</w:t>
+            <w:tab/>
+            <w:t>12</w:t>
+          </w:r>
         </w:p>
         <w:p>
           <w:pPr>
@@ -594,16 +505,12 @@
             </w:tabs>
             <w:rPr/>
           </w:pPr>
-          <w:hyperlink w:anchor="__RefHeading___Toc109_3754114533" w:tooltip="4. Utilitários de Interface (UI)">
-            <w:r>
-              <w:rPr>
-                <w:rStyle w:val="Vnculodendice"/>
-              </w:rPr>
-              <w:t>4. Utilitários de Interface (UI)</w:t>
-              <w:tab/>
-              <w:t>12</w:t>
-            </w:r>
-          </w:hyperlink>
+          <w:r>
+            <w:rPr/>
+            <w:t>4. Utilitários de Interface (UI)</w:t>
+            <w:tab/>
+            <w:t>12</w:t>
+          </w:r>
         </w:p>
         <w:p>
           <w:pPr>
@@ -614,16 +521,12 @@
             </w:tabs>
             <w:rPr/>
           </w:pPr>
-          <w:hyperlink w:anchor="__RefHeading___Toc111_3754114533" w:tooltip="Destaque Técnico para a Documentação:">
-            <w:r>
-              <w:rPr>
-                <w:rStyle w:val="Vnculodendice"/>
-              </w:rPr>
-              <w:t>Destaque Técnico para a Documentação:</w:t>
-              <w:tab/>
-              <w:t>12</w:t>
-            </w:r>
-          </w:hyperlink>
+          <w:r>
+            <w:rPr/>
+            <w:t>Destaque Técnico para a Documentação:</w:t>
+            <w:tab/>
+            <w:t>12</w:t>
+          </w:r>
         </w:p>
         <w:p>
           <w:pPr>
@@ -634,16 +537,12 @@
             </w:tabs>
             <w:rPr/>
           </w:pPr>
-          <w:hyperlink w:anchor="__RefHeading___Toc336_3754114533" w:tooltip="carregar.js">
-            <w:r>
-              <w:rPr>
-                <w:rStyle w:val="Vnculodendice"/>
-              </w:rPr>
-              <w:t>carregar.js</w:t>
-              <w:tab/>
-              <w:t>13</w:t>
-            </w:r>
-          </w:hyperlink>
+          <w:r>
+            <w:rPr/>
+            <w:t>carregar.js</w:t>
+            <w:tab/>
+            <w:t>13</w:t>
+          </w:r>
         </w:p>
         <w:p>
           <w:pPr>
@@ -654,16 +553,12 @@
             </w:tabs>
             <w:rPr/>
           </w:pPr>
-          <w:hyperlink w:anchor="__RefHeading___Toc417_3016748398" w:tooltip="1. Sistema de Injeção de Componentes Globais">
-            <w:r>
-              <w:rPr>
-                <w:rStyle w:val="Vnculodendice"/>
-              </w:rPr>
-              <w:t>1. Sistema de Injeção de Componentes Globais</w:t>
-              <w:tab/>
-              <w:t>13</w:t>
-            </w:r>
-          </w:hyperlink>
+          <w:r>
+            <w:rPr/>
+            <w:t>1. Sistema de Injeção de Componentes Globais</w:t>
+            <w:tab/>
+            <w:t>13</w:t>
+          </w:r>
         </w:p>
         <w:p>
           <w:pPr>
@@ -674,16 +569,12 @@
             </w:tabs>
             <w:rPr/>
           </w:pPr>
-          <w:hyperlink w:anchor="__RefHeading___Toc419_3016748398" w:tooltip="2. Ferramentas de Acessibilidade e Preferências">
-            <w:r>
-              <w:rPr>
-                <w:rStyle w:val="Vnculodendice"/>
-              </w:rPr>
-              <w:t>2. Ferramentas de Acessibilidade e Preferências</w:t>
-              <w:tab/>
-              <w:t>13</w:t>
-            </w:r>
-          </w:hyperlink>
+          <w:r>
+            <w:rPr/>
+            <w:t>2. Ferramentas de Acessibilidade e Preferências</w:t>
+            <w:tab/>
+            <w:t>13</w:t>
+          </w:r>
         </w:p>
         <w:p>
           <w:pPr>
@@ -694,16 +585,12 @@
             </w:tabs>
             <w:rPr/>
           </w:pPr>
-          <w:hyperlink w:anchor="__RefHeading___Toc421_3016748398" w:tooltip="3. Navegação e Utilidades de Interface (UX)">
-            <w:r>
-              <w:rPr>
-                <w:rStyle w:val="Vnculodendice"/>
-              </w:rPr>
-              <w:t>3. Navegação e Utilidades de Interface (UX)</w:t>
-              <w:tab/>
-              <w:t>13</w:t>
-            </w:r>
-          </w:hyperlink>
+          <w:r>
+            <w:rPr/>
+            <w:t>3. Navegação e Utilidades de Interface (UX)</w:t>
+            <w:tab/>
+            <w:t>13</w:t>
+          </w:r>
         </w:p>
         <w:p>
           <w:pPr>
@@ -714,16 +601,12 @@
             </w:tabs>
             <w:rPr/>
           </w:pPr>
-          <w:hyperlink w:anchor="__RefHeading___Toc423_3016748398" w:tooltip="4. Automação de Metadados de Rodapé">
-            <w:r>
-              <w:rPr>
-                <w:rStyle w:val="Vnculodendice"/>
-              </w:rPr>
-              <w:t>4. Automação de Metadados de Rodapé</w:t>
-              <w:tab/>
-              <w:t>14</w:t>
-            </w:r>
-          </w:hyperlink>
+          <w:r>
+            <w:rPr/>
+            <w:t>4. Automação de Metadados de Rodapé</w:t>
+            <w:tab/>
+            <w:t>14</w:t>
+          </w:r>
         </w:p>
         <w:p>
           <w:pPr>
@@ -734,16 +617,12 @@
             </w:tabs>
             <w:rPr/>
           </w:pPr>
-          <w:hyperlink w:anchor="__RefHeading___Toc425_3016748398" w:tooltip="Destaque Técnico para a Documentação:">
-            <w:r>
-              <w:rPr>
-                <w:rStyle w:val="Vnculodendice"/>
-              </w:rPr>
-              <w:t>Destaque Técnico para a Documentação:</w:t>
-              <w:tab/>
-              <w:t>14</w:t>
-            </w:r>
-          </w:hyperlink>
+          <w:r>
+            <w:rPr/>
+            <w:t>Destaque Técnico para a Documentação:</w:t>
+            <w:tab/>
+            <w:t>14</w:t>
+          </w:r>
         </w:p>
         <w:p>
           <w:pPr>
@@ -754,16 +633,12 @@
             </w:tabs>
             <w:rPr/>
           </w:pPr>
-          <w:hyperlink w:anchor="__RefHeading___Toc427_3016748398" w:tooltip="1. HUB de Identificação e Boas-Vindas">
-            <w:r>
-              <w:rPr>
-                <w:rStyle w:val="Vnculodendice"/>
-              </w:rPr>
-              <w:t>1. HUB de Identificação e Boas-Vindas</w:t>
-              <w:tab/>
-              <w:t>14</w:t>
-            </w:r>
-          </w:hyperlink>
+          <w:r>
+            <w:rPr/>
+            <w:t>1. HUB de Identificação e Boas-Vindas</w:t>
+            <w:tab/>
+            <w:t>14</w:t>
+          </w:r>
         </w:p>
         <w:p>
           <w:pPr>
@@ -774,16 +649,12 @@
             </w:tabs>
             <w:rPr/>
           </w:pPr>
-          <w:hyperlink w:anchor="__RefHeading___Toc429_3016748398" w:tooltip="2. Sistema de Resumo Geral e Troféus (resumo-geral)">
-            <w:r>
-              <w:rPr>
-                <w:rStyle w:val="Vnculodendice"/>
-              </w:rPr>
-              <w:t>2. Sistema de Resumo Geral e Troféus (resumo-geral)</w:t>
-              <w:tab/>
-              <w:t>14</w:t>
-            </w:r>
-          </w:hyperlink>
+          <w:r>
+            <w:rPr/>
+            <w:t>2. Sistema de Resumo Geral e Troféus (resumo-geral)</w:t>
+            <w:tab/>
+            <w:t>14</w:t>
+          </w:r>
         </w:p>
         <w:p>
           <w:pPr>
@@ -794,16 +665,12 @@
             </w:tabs>
             <w:rPr/>
           </w:pPr>
-          <w:hyperlink w:anchor="__RefHeading___Toc431_3016748398" w:tooltip="3. Dinâmica de Inspiração (Motor de Frases)">
-            <w:r>
-              <w:rPr>
-                <w:rStyle w:val="Vnculodendice"/>
-              </w:rPr>
-              <w:t>3. Dinâmica de Inspiração (Motor de Frases)</w:t>
-              <w:tab/>
-              <w:t>15</w:t>
-            </w:r>
-          </w:hyperlink>
+          <w:r>
+            <w:rPr/>
+            <w:t>3. Dinâmica de Inspiração (Motor de Frases)</w:t>
+            <w:tab/>
+            <w:t>15</w:t>
+          </w:r>
         </w:p>
         <w:p>
           <w:pPr>
@@ -814,16 +681,12 @@
             </w:tabs>
             <w:rPr/>
           </w:pPr>
-          <w:hyperlink w:anchor="__RefHeading___Toc433_3016748398" w:tooltip="4. Integração de Componentes Globais">
-            <w:r>
-              <w:rPr>
-                <w:rStyle w:val="Vnculodendice"/>
-              </w:rPr>
-              <w:t>4. Integração de Componentes Globais</w:t>
-              <w:tab/>
-              <w:t>15</w:t>
-            </w:r>
-          </w:hyperlink>
+          <w:r>
+            <w:rPr/>
+            <w:t>4. Integração de Componentes Globais</w:t>
+            <w:tab/>
+            <w:t>15</w:t>
+          </w:r>
         </w:p>
         <w:p>
           <w:pPr>
@@ -834,16 +697,12 @@
             </w:tabs>
             <w:rPr/>
           </w:pPr>
-          <w:hyperlink w:anchor="__RefHeading___Toc943_3016748398" w:tooltip="Jsquestoes-padrao.js">
-            <w:r>
-              <w:rPr>
-                <w:rStyle w:val="Vnculodendice"/>
-              </w:rPr>
-              <w:t>Jsquestoes-padrao.js</w:t>
-              <w:tab/>
-              <w:t>16</w:t>
-            </w:r>
-          </w:hyperlink>
+          <w:r>
+            <w:rPr/>
+            <w:t>Jsquestoes-padrao.js</w:t>
+            <w:tab/>
+            <w:t>16</w:t>
+          </w:r>
         </w:p>
         <w:p>
           <w:pPr>
@@ -854,16 +713,12 @@
             </w:tabs>
             <w:rPr/>
           </w:pPr>
-          <w:hyperlink w:anchor="__RefHeading___Toc945_3016748398" w:tooltip="Resumo:">
-            <w:r>
-              <w:rPr>
-                <w:rStyle w:val="Vnculodendice"/>
-              </w:rPr>
-              <w:t>Resumo:</w:t>
-              <w:tab/>
-              <w:t>16</w:t>
-            </w:r>
-          </w:hyperlink>
+          <w:r>
+            <w:rPr/>
+            <w:t>Resumo:</w:t>
+            <w:tab/>
+            <w:t>16</w:t>
+          </w:r>
         </w:p>
         <w:p>
           <w:pPr>
@@ -874,16 +729,12 @@
             </w:tabs>
             <w:rPr/>
           </w:pPr>
-          <w:hyperlink w:anchor="__RefHeading___Toc947_3016748398" w:tooltip="Por que deletar é melhor que deixar em branco?">
-            <w:r>
-              <w:rPr>
-                <w:rStyle w:val="Vnculodendice"/>
-              </w:rPr>
-              <w:t>Por que deletar é melhor que deixar em branco?</w:t>
-              <w:tab/>
-              <w:t>17</w:t>
-            </w:r>
-          </w:hyperlink>
+          <w:r>
+            <w:rPr/>
+            <w:t>Por que deletar é melhor que deixar em branco?</w:t>
+            <w:tab/>
+            <w:t>17</w:t>
+          </w:r>
         </w:p>
         <w:p>
           <w:pPr>
@@ -894,16 +745,12 @@
             </w:tabs>
             <w:rPr/>
           </w:pPr>
-          <w:hyperlink w:anchor="__RefHeading___Toc949_3016748398" w:tooltip="O que acontece se eu esquecer e deixar o campo?">
-            <w:r>
-              <w:rPr>
-                <w:rStyle w:val="Vnculodendice"/>
-              </w:rPr>
-              <w:t>O que acontece se eu esquecer e deixar o campo?</w:t>
-              <w:tab/>
-              <w:t>17</w:t>
-            </w:r>
-          </w:hyperlink>
+          <w:r>
+            <w:rPr/>
+            <w:t>O que acontece se eu esquecer e deixar o campo?</w:t>
+            <w:tab/>
+            <w:t>17</w:t>
+          </w:r>
         </w:p>
         <w:p>
           <w:pPr>
@@ -914,16 +761,12 @@
             </w:tabs>
             <w:rPr/>
           </w:pPr>
-          <w:hyperlink w:anchor="__RefHeading___Toc1627_291806104" w:tooltip="Acessando o PHP:">
-            <w:r>
-              <w:rPr>
-                <w:rStyle w:val="Vnculodendice"/>
-              </w:rPr>
-              <w:t>Acessando o PHP:</w:t>
-              <w:tab/>
-              <w:t>18</w:t>
-            </w:r>
-          </w:hyperlink>
+          <w:r>
+            <w:rPr/>
+            <w:t>Acessando o PHP:</w:t>
+            <w:tab/>
+            <w:t>18</w:t>
+          </w:r>
         </w:p>
         <w:p>
           <w:pPr>
@@ -934,16 +777,12 @@
             </w:tabs>
             <w:rPr/>
           </w:pPr>
-          <w:hyperlink w:anchor="__RefHeading___Toc633_2288496956" w:tooltip="duvid-core.js">
-            <w:r>
-              <w:rPr>
-                <w:rStyle w:val="Vnculodendice"/>
-              </w:rPr>
-              <w:t>duvid-core.js</w:t>
-              <w:tab/>
-              <w:t>19</w:t>
-            </w:r>
-          </w:hyperlink>
+          <w:r>
+            <w:rPr/>
+            <w:t>duvid-core.js</w:t>
+            <w:tab/>
+            <w:t>19</w:t>
+          </w:r>
         </w:p>
         <w:p>
           <w:pPr>
@@ -954,16 +793,12 @@
             </w:tabs>
             <w:rPr/>
           </w:pPr>
-          <w:hyperlink w:anchor="__RefHeading___Toc998_4280899997" w:tooltip="Modelo json questões:">
-            <w:r>
-              <w:rPr>
-                <w:rStyle w:val="Vnculodendice"/>
-              </w:rPr>
-              <w:t>Modelo json questões:</w:t>
-              <w:tab/>
-              <w:t>21</w:t>
-            </w:r>
-          </w:hyperlink>
+          <w:r>
+            <w:rPr/>
+            <w:t>Modelo json questões:</w:t>
+            <w:tab/>
+            <w:t>21</w:t>
+          </w:r>
         </w:p>
         <w:p>
           <w:pPr>
@@ -974,22 +809,16 @@
             </w:tabs>
             <w:rPr/>
           </w:pPr>
-          <w:hyperlink w:anchor="__RefHeading___Toc1000_4280899997" w:tooltip="🛠️ Comando para o VS Code">
-            <w:r>
-              <w:rPr>
-                <w:rStyle w:val="Vnculodendice"/>
-              </w:rPr>
-              <w:t xml:space="preserve">🛠️ </w:t>
-            </w:r>
-            <w:r>
-              <w:rPr>
-                <w:rStyle w:val="Vnculodendice"/>
-              </w:rPr>
-              <w:t>Comando para o VS Code</w:t>
-              <w:tab/>
-              <w:t>24</w:t>
-            </w:r>
-          </w:hyperlink>
+          <w:r>
+            <w:rPr/>
+            <w:t xml:space="preserve">🛠️ </w:t>
+          </w:r>
+          <w:r>
+            <w:rPr/>
+            <w:t>Comando para o VS Code</w:t>
+            <w:tab/>
+            <w:t>24</w:t>
+          </w:r>
         </w:p>
         <w:p>
           <w:pPr>
@@ -1000,22 +829,16 @@
             </w:tabs>
             <w:rPr/>
           </w:pPr>
-          <w:hyperlink w:anchor="__RefHeading___Toc1002_4280899997" w:tooltip="🧐 O que essa lógica faz?">
-            <w:r>
-              <w:rPr>
-                <w:rStyle w:val="Vnculodendice"/>
-              </w:rPr>
-              <w:t xml:space="preserve">🧐 </w:t>
-            </w:r>
-            <w:r>
-              <w:rPr>
-                <w:rStyle w:val="Vnculodendice"/>
-              </w:rPr>
-              <w:t>O que essa lógica faz?</w:t>
-              <w:tab/>
-              <w:t>24</w:t>
-            </w:r>
-          </w:hyperlink>
+          <w:r>
+            <w:rPr/>
+            <w:t xml:space="preserve">🧐 </w:t>
+          </w:r>
+          <w:r>
+            <w:rPr/>
+            <w:t>O que essa lógica faz?</w:t>
+            <w:tab/>
+            <w:t>24</w:t>
+          </w:r>
         </w:p>
         <w:p>
           <w:pPr>
@@ -1026,16 +849,12 @@
             </w:tabs>
             <w:rPr/>
           </w:pPr>
-          <w:hyperlink w:anchor="__RefHeading___Toc1592_1703596573" w:tooltip="PRÓXIMAS IMPLEMENTAÇÕES">
-            <w:r>
-              <w:rPr>
-                <w:rStyle w:val="Vnculodendice"/>
-              </w:rPr>
-              <w:t>PRÓXIMAS IMPLEMENTAÇÕES</w:t>
-              <w:tab/>
-              <w:t>25</w:t>
-            </w:r>
-          </w:hyperlink>
+          <w:r>
+            <w:rPr/>
+            <w:t>PRÓXIMAS IMPLEMENTAÇÕES</w:t>
+            <w:tab/>
+            <w:t>25</w:t>
+          </w:r>
         </w:p>
         <w:p>
           <w:pPr>
@@ -1046,16 +865,12 @@
             </w:tabs>
             <w:rPr/>
           </w:pPr>
-          <w:hyperlink w:anchor="__RefHeading___Toc964_3689506473" w:tooltip="Mapa de Implementação Duvid 2026">
-            <w:r>
-              <w:rPr>
-                <w:rStyle w:val="Vnculodendice"/>
-              </w:rPr>
-              <w:t>Mapa de Implementação Duvid 2026</w:t>
-              <w:tab/>
-              <w:t>25</w:t>
-            </w:r>
-          </w:hyperlink>
+          <w:r>
+            <w:rPr/>
+            <w:t>Mapa de Implementação Duvid 2026</w:t>
+            <w:tab/>
+            <w:t>25</w:t>
+          </w:r>
         </w:p>
         <w:p>
           <w:pPr>
@@ -1066,16 +881,12 @@
             </w:tabs>
             <w:rPr/>
           </w:pPr>
-          <w:hyperlink w:anchor="__RefHeading___Toc966_3689506473" w:tooltip="Camada 1: O Ciclo de Retenção (O que faz o aluno voltar)">
-            <w:r>
-              <w:rPr>
-                <w:rStyle w:val="Vnculodendice"/>
-              </w:rPr>
-              <w:t>Camada 1: O Ciclo de Retenção (O que faz o aluno voltar)</w:t>
-              <w:tab/>
-              <w:t>25</w:t>
-            </w:r>
-          </w:hyperlink>
+          <w:r>
+            <w:rPr/>
+            <w:t>Camada 1: O Ciclo de Retenção (O que faz o aluno voltar)</w:t>
+            <w:tab/>
+            <w:t>25</w:t>
+          </w:r>
         </w:p>
         <w:p>
           <w:pPr>
@@ -1086,16 +897,12 @@
             </w:tabs>
             <w:rPr/>
           </w:pPr>
-          <w:hyperlink w:anchor="__RefHeading___Toc968_3689506473" w:tooltip="Camada 2: O Ciclo de Engajamento (O que faz o aluno querer ganhar)">
-            <w:r>
-              <w:rPr>
-                <w:rStyle w:val="Vnculodendice"/>
-              </w:rPr>
-              <w:t>Camada 2: O Ciclo de Engajamento (O que faz o aluno querer ganhar)</w:t>
-              <w:tab/>
-              <w:t>25</w:t>
-            </w:r>
-          </w:hyperlink>
+          <w:r>
+            <w:rPr/>
+            <w:t>Camada 2: O Ciclo de Engajamento (O que faz o aluno querer ganhar)</w:t>
+            <w:tab/>
+            <w:t>25</w:t>
+          </w:r>
         </w:p>
         <w:p>
           <w:pPr>
@@ -1106,16 +913,12 @@
             </w:tabs>
             <w:rPr/>
           </w:pPr>
-          <w:hyperlink w:anchor="__RefHeading___Toc970_3689506473" w:tooltip="Camada 3: Inteligência e UX (O que facilita a vida do aluno)">
-            <w:r>
-              <w:rPr>
-                <w:rStyle w:val="Vnculodendice"/>
-              </w:rPr>
-              <w:t>Camada 3: Inteligência e UX (O que facilita a vida do aluno)</w:t>
-              <w:tab/>
-              <w:t>25</w:t>
-            </w:r>
-          </w:hyperlink>
+          <w:r>
+            <w:rPr/>
+            <w:t>Camada 3: Inteligência e UX (O que facilita a vida do aluno)</w:t>
+            <w:tab/>
+            <w:t>25</w:t>
+          </w:r>
         </w:p>
         <w:p>
           <w:pPr>
@@ -1126,22 +929,16 @@
             </w:tabs>
             <w:rPr/>
           </w:pPr>
-          <w:hyperlink w:anchor="__RefHeading___Toc972_3689506473" w:tooltip="💡 Novas Sugestões de Mestre">
-            <w:r>
-              <w:rPr>
-                <w:rStyle w:val="Vnculodendice"/>
-              </w:rPr>
-              <w:t xml:space="preserve">💡 </w:t>
-            </w:r>
-            <w:r>
-              <w:rPr>
-                <w:rStyle w:val="Vnculodendice"/>
-              </w:rPr>
-              <w:t>Novas Sugestões de Mestre</w:t>
-              <w:tab/>
-              <w:t>25</w:t>
-            </w:r>
-          </w:hyperlink>
+          <w:r>
+            <w:rPr/>
+            <w:t xml:space="preserve">💡 </w:t>
+          </w:r>
+          <w:r>
+            <w:rPr/>
+            <w:t>Novas Sugestões de Mestre</w:t>
+            <w:tab/>
+            <w:t>25</w:t>
+          </w:r>
         </w:p>
         <w:p>
           <w:pPr>
@@ -1152,16 +949,12 @@
             </w:tabs>
             <w:rPr/>
           </w:pPr>
-          <w:hyperlink w:anchor="__RefHeading___Toc974_3689506473" w:tooltip="1. Sistema de &quot;Combo&quot; de Acertos">
-            <w:r>
-              <w:rPr>
-                <w:rStyle w:val="Vnculodendice"/>
-              </w:rPr>
-              <w:t>1. Sistema de "Combo" de Acertos</w:t>
-              <w:tab/>
-              <w:t>25</w:t>
-            </w:r>
-          </w:hyperlink>
+          <w:r>
+            <w:rPr/>
+            <w:t>1. Sistema de "Combo" de Acertos</w:t>
+            <w:tab/>
+            <w:t>25</w:t>
+          </w:r>
         </w:p>
         <w:p>
           <w:pPr>
@@ -1172,16 +965,12 @@
             </w:tabs>
             <w:rPr/>
           </w:pPr>
-          <w:hyperlink w:anchor="__RefHeading___Toc976_3689506473" w:tooltip="2. O &quot;Dicionário&quot; (Glossário Interativo)">
-            <w:r>
-              <w:rPr>
-                <w:rStyle w:val="Vnculodendice"/>
-              </w:rPr>
-              <w:t>2. O "Dicionário" (Glossário Interativo)</w:t>
-              <w:tab/>
-              <w:t>26</w:t>
-            </w:r>
-          </w:hyperlink>
+          <w:r>
+            <w:rPr/>
+            <w:t>2. O "Dicionário" (Glossário Interativo)</w:t>
+            <w:tab/>
+            <w:t>26</w:t>
+          </w:r>
         </w:p>
         <w:p>
           <w:pPr>
@@ -1192,16 +981,12 @@
             </w:tabs>
             <w:rPr/>
           </w:pPr>
-          <w:hyperlink w:anchor="__RefHeading___Toc978_3689506473" w:tooltip="3. Modo &quot;Speedrun&quot; (Desafio de Tempo)">
-            <w:r>
-              <w:rPr>
-                <w:rStyle w:val="Vnculodendice"/>
-              </w:rPr>
-              <w:t>3. Modo "Speedrun" (Desafio de Tempo)</w:t>
-              <w:tab/>
-              <w:t>26</w:t>
-            </w:r>
-          </w:hyperlink>
+          <w:r>
+            <w:rPr/>
+            <w:t>3. Modo "Speedrun" (Desafio de Tempo)</w:t>
+            <w:tab/>
+            <w:t>26</w:t>
+          </w:r>
         </w:p>
         <w:p>
           <w:pPr>
@@ -1212,16 +997,12 @@
             </w:tabs>
             <w:rPr/>
           </w:pPr>
-          <w:hyperlink w:anchor="__RefHeading___Toc980_3689506473" w:tooltip="4. Personalização de Avatar (O Globinho)">
-            <w:r>
-              <w:rPr>
-                <w:rStyle w:val="Vnculodendice"/>
-              </w:rPr>
-              <w:t>4. Personalização de Avatar (O Globinho)</w:t>
-              <w:tab/>
-              <w:t>26</w:t>
-            </w:r>
-          </w:hyperlink>
+          <w:r>
+            <w:rPr/>
+            <w:t>4. Personalização de Avatar (O Globinho)</w:t>
+            <w:tab/>
+            <w:t>26</w:t>
+          </w:r>
         </w:p>
         <w:p>
           <w:pPr>
@@ -1232,16 +1013,12 @@
             </w:tabs>
             <w:rPr/>
           </w:pPr>
-          <w:hyperlink w:anchor="__RefHeading___Toc13762_3315236242" w:tooltip="5. Explorar Duvid – inserir um card Atividades.">
-            <w:r>
-              <w:rPr>
-                <w:rStyle w:val="Vnculodendice"/>
-              </w:rPr>
-              <w:t>5. Explorar Duvid – inserir um card Atividades.</w:t>
-              <w:tab/>
-              <w:t>26</w:t>
-            </w:r>
-          </w:hyperlink>
+          <w:r>
+            <w:rPr/>
+            <w:t>5. Explorar Duvid – inserir um card Atividades.</w:t>
+            <w:tab/>
+            <w:t>26</w:t>
+          </w:r>
         </w:p>
         <w:p>
           <w:pPr>
@@ -1252,16 +1029,12 @@
             </w:tabs>
             <w:rPr/>
           </w:pPr>
-          <w:hyperlink w:anchor="__RefHeading___Toc13764_3315236242" w:tooltip="6. Inserir mais dados via API">
-            <w:r>
-              <w:rPr>
-                <w:rStyle w:val="Vnculodendice"/>
-              </w:rPr>
-              <w:t>6. Inserir mais dados via API</w:t>
-              <w:tab/>
-              <w:t>26</w:t>
-            </w:r>
-          </w:hyperlink>
+          <w:r>
+            <w:rPr/>
+            <w:t>6. Inserir mais dados via API</w:t>
+            <w:tab/>
+            <w:t>26</w:t>
+          </w:r>
         </w:p>
         <w:p>
           <w:pPr>
@@ -1272,16 +1045,12 @@
             </w:tabs>
             <w:rPr/>
           </w:pPr>
-          <w:hyperlink w:anchor="__RefHeading___Toc13766_3315236242" w:tooltip="7. Pesquisar sobre segurança de API Keys e Variáveis de Ambiente&quot;">
-            <w:r>
-              <w:rPr>
-                <w:rStyle w:val="Vnculodendice"/>
-              </w:rPr>
-              <w:t>7. Pesquisar sobre segurança de API Keys e Variáveis de Ambiente"</w:t>
-              <w:tab/>
-              <w:t>26</w:t>
-            </w:r>
-          </w:hyperlink>
+          <w:r>
+            <w:rPr/>
+            <w:t>7. Pesquisar sobre segurança de API Keys e Variáveis de Ambiente"</w:t>
+            <w:tab/>
+            <w:t>26</w:t>
+          </w:r>
         </w:p>
         <w:p>
           <w:pPr>
@@ -1292,20 +1061,14 @@
             </w:tabs>
             <w:rPr/>
           </w:pPr>
-          <w:hyperlink w:anchor="__RefHeading___Toc1605_1582771363" w:tooltip="Prompts">
-            <w:r>
-              <w:rPr>
-                <w:rStyle w:val="Vnculodendice"/>
-              </w:rPr>
-              <w:t>Prompts</w:t>
-              <w:tab/>
-              <w:t>28</w:t>
-            </w:r>
-          </w:hyperlink>
           <w:r>
-            <w:rPr>
-              <w:rStyle w:val="Vnculodendice"/>
-            </w:rPr>
+            <w:rPr/>
+            <w:t>Prompts</w:t>
+            <w:tab/>
+            <w:t>28</w:t>
+          </w:r>
+          <w:r>
+            <w:rPr/>
             <w:fldChar w:fldCharType="end"/>
           </w:r>
         </w:p>
@@ -1548,7 +1311,7 @@
       </w:r>
       <w:r>
         <w:rPr>
-          <w:rStyle w:val="Cdigo-fonte"/>
+          <w:rStyle w:val="Cdigo-fonteuser"/>
         </w:rPr>
         <w:t>DuvidDB</w:t>
       </w:r>
@@ -1742,7 +1505,7 @@
           </w:tcPr>
           <w:p>
             <w:pPr>
-              <w:pStyle w:val="Contedodatabela"/>
+              <w:pStyle w:val="Contedodatabelauser"/>
               <w:spacing w:lineRule="auto" w:line="274" w:before="0" w:after="0"/>
               <w:ind w:hanging="0" w:start="0" w:end="0"/>
               <w:rPr/>
@@ -1769,7 +1532,7 @@
           </w:tcPr>
           <w:p>
             <w:pPr>
-              <w:pStyle w:val="Contedodatabela"/>
+              <w:pStyle w:val="Contedodatabelauser"/>
               <w:spacing w:lineRule="auto" w:line="274" w:before="0" w:after="0"/>
               <w:ind w:hanging="0" w:start="0" w:end="0"/>
               <w:rPr/>
@@ -1796,7 +1559,7 @@
           </w:tcPr>
           <w:p>
             <w:pPr>
-              <w:pStyle w:val="Contedodatabela"/>
+              <w:pStyle w:val="Contedodatabelauser"/>
               <w:spacing w:lineRule="auto" w:line="274" w:before="0" w:after="0"/>
               <w:ind w:hanging="0" w:start="0" w:end="0"/>
               <w:rPr/>
@@ -1826,14 +1589,14 @@
           </w:tcPr>
           <w:p>
             <w:pPr>
-              <w:pStyle w:val="Contedodatabela"/>
+              <w:pStyle w:val="Contedodatabelauser"/>
               <w:spacing w:lineRule="auto" w:line="274" w:before="0" w:after="140"/>
               <w:ind w:hanging="0" w:start="0" w:end="0"/>
               <w:rPr/>
             </w:pPr>
             <w:r>
               <w:rPr>
-                <w:rStyle w:val="Cdigo-fonte"/>
+                <w:rStyle w:val="Cdigo-fonteuser"/>
                 <w:rFonts w:ascii="Google Sans Text;sans-serif" w:hAnsi="Google Sans Text;sans-serif"/>
                 <w:b/>
               </w:rPr>
@@ -1854,7 +1617,7 @@
           </w:tcPr>
           <w:p>
             <w:pPr>
-              <w:pStyle w:val="Contedodatabela"/>
+              <w:pStyle w:val="Contedodatabelauser"/>
               <w:spacing w:lineRule="auto" w:line="274" w:before="0" w:after="140"/>
               <w:ind w:hanging="0" w:start="0" w:end="0"/>
               <w:rPr>
@@ -1882,7 +1645,7 @@
           </w:tcPr>
           <w:p>
             <w:pPr>
-              <w:pStyle w:val="Contedodatabela"/>
+              <w:pStyle w:val="Contedodatabelauser"/>
               <w:spacing w:lineRule="auto" w:line="274" w:before="0" w:after="140"/>
               <w:ind w:hanging="0" w:start="0" w:end="0"/>
               <w:rPr>
@@ -1915,14 +1678,14 @@
           </w:tcPr>
           <w:p>
             <w:pPr>
-              <w:pStyle w:val="Contedodatabela"/>
+              <w:pStyle w:val="Contedodatabelauser"/>
               <w:spacing w:lineRule="auto" w:line="274" w:before="0" w:after="140"/>
               <w:ind w:hanging="0" w:start="0" w:end="0"/>
               <w:rPr/>
             </w:pPr>
             <w:r>
               <w:rPr>
-                <w:rStyle w:val="Cdigo-fonte"/>
+                <w:rStyle w:val="Cdigo-fonteuser"/>
                 <w:rFonts w:ascii="Google Sans Text;sans-serif" w:hAnsi="Google Sans Text;sans-serif"/>
                 <w:b/>
               </w:rPr>
@@ -1943,7 +1706,7 @@
           </w:tcPr>
           <w:p>
             <w:pPr>
-              <w:pStyle w:val="Contedodatabela"/>
+              <w:pStyle w:val="Contedodatabelauser"/>
               <w:spacing w:lineRule="auto" w:line="274" w:before="0" w:after="140"/>
               <w:ind w:hanging="0" w:start="0" w:end="0"/>
               <w:rPr/>
@@ -1956,7 +1719,7 @@
             </w:r>
             <w:r>
               <w:rPr>
-                <w:rStyle w:val="Cdigo-fonte"/>
+                <w:rStyle w:val="Cdigo-fonteuser"/>
                 <w:rFonts w:ascii="Google Sans Text;sans-serif" w:hAnsi="Google Sans Text;sans-serif"/>
               </w:rPr>
               <w:t>DuvidDB</w:t>
@@ -1982,7 +1745,7 @@
           </w:tcPr>
           <w:p>
             <w:pPr>
-              <w:pStyle w:val="Contedodatabela"/>
+              <w:pStyle w:val="Contedodatabelauser"/>
               <w:spacing w:lineRule="auto" w:line="274" w:before="0" w:after="140"/>
               <w:ind w:hanging="0" w:start="0" w:end="0"/>
               <w:rPr>
@@ -2015,14 +1778,14 @@
           </w:tcPr>
           <w:p>
             <w:pPr>
-              <w:pStyle w:val="Contedodatabela"/>
+              <w:pStyle w:val="Contedodatabelauser"/>
               <w:spacing w:lineRule="auto" w:line="274" w:before="0" w:after="140"/>
               <w:ind w:hanging="0" w:start="0" w:end="0"/>
               <w:rPr/>
             </w:pPr>
             <w:r>
               <w:rPr>
-                <w:rStyle w:val="Cdigo-fonte"/>
+                <w:rStyle w:val="Cdigo-fonteuser"/>
                 <w:rFonts w:ascii="Google Sans Text;sans-serif" w:hAnsi="Google Sans Text;sans-serif"/>
                 <w:b/>
               </w:rPr>
@@ -2043,7 +1806,7 @@
           </w:tcPr>
           <w:p>
             <w:pPr>
-              <w:pStyle w:val="Contedodatabela"/>
+              <w:pStyle w:val="Contedodatabelauser"/>
               <w:spacing w:lineRule="auto" w:line="274" w:before="0" w:after="140"/>
               <w:ind w:hanging="0" w:start="0" w:end="0"/>
               <w:rPr>
@@ -2071,7 +1834,7 @@
           </w:tcPr>
           <w:p>
             <w:pPr>
-              <w:pStyle w:val="Contedodatabela"/>
+              <w:pStyle w:val="Contedodatabelauser"/>
               <w:spacing w:lineRule="auto" w:line="274" w:before="0" w:after="140"/>
               <w:ind w:hanging="0" w:start="0" w:end="0"/>
               <w:rPr>
@@ -2104,42 +1867,18 @@
           </w:tcPr>
           <w:p>
             <w:pPr>
-              <w:pStyle w:val="Contedodatabela"/>
+              <w:pStyle w:val="Contedodatabelauser"/>
               <w:spacing w:lineRule="auto" w:line="274" w:before="0" w:after="140"/>
               <w:ind w:hanging="0" w:start="0" w:end="0"/>
               <w:rPr/>
             </w:pPr>
             <w:r>
               <w:rPr>
-                <w:rStyle w:val="Cdigo-fonte"/>
+                <w:rStyle w:val="Cdigo-fonteuser"/>
                 <w:rFonts w:ascii="Google Sans Text;sans-serif" w:hAnsi="Google Sans Text;sans-serif"/>
                 <w:b/>
               </w:rPr>
-              <w:t>duvid</w:t>
-            </w:r>
-            <w:r>
-              <w:rPr>
-                <w:rStyle w:val="Cdigo-fonte"/>
-                <w:rFonts w:ascii="Google Sans Text;sans-serif" w:hAnsi="Google Sans Text;sans-serif"/>
-                <w:b/>
-              </w:rPr>
-              <w:t>_</w:t>
-            </w:r>
-            <w:r>
-              <w:rPr>
-                <w:rStyle w:val="Cdigo-fonte"/>
-                <w:rFonts w:ascii="Google Sans Text;sans-serif" w:hAnsi="Google Sans Text;sans-serif"/>
-                <w:b/>
-              </w:rPr>
-              <w:t>api</w:t>
-            </w:r>
-            <w:r>
-              <w:rPr>
-                <w:rStyle w:val="Cdigo-fonte"/>
-                <w:rFonts w:ascii="Google Sans Text;sans-serif" w:hAnsi="Google Sans Text;sans-serif"/>
-                <w:b/>
-              </w:rPr>
-              <w:t>.php</w:t>
+              <w:t>duvid_api.php</w:t>
             </w:r>
           </w:p>
         </w:tc>
@@ -2156,7 +1895,7 @@
           </w:tcPr>
           <w:p>
             <w:pPr>
-              <w:pStyle w:val="Contedodatabela"/>
+              <w:pStyle w:val="Contedodatabelauser"/>
               <w:spacing w:lineRule="auto" w:line="274" w:before="0" w:after="140"/>
               <w:ind w:hanging="0" w:start="0" w:end="0"/>
               <w:rPr>
@@ -2184,7 +1923,7 @@
           </w:tcPr>
           <w:p>
             <w:pPr>
-              <w:pStyle w:val="Contedodatabela"/>
+              <w:pStyle w:val="Contedodatabelauser"/>
               <w:spacing w:lineRule="auto" w:line="274" w:before="0" w:after="140"/>
               <w:ind w:hanging="0" w:start="0" w:end="0"/>
               <w:rPr>
@@ -2217,14 +1956,14 @@
           </w:tcPr>
           <w:p>
             <w:pPr>
-              <w:pStyle w:val="Contedodatabela"/>
+              <w:pStyle w:val="Contedodatabelauser"/>
               <w:spacing w:lineRule="auto" w:line="274" w:before="0" w:after="140"/>
               <w:ind w:hanging="0" w:start="0" w:end="0"/>
               <w:rPr/>
             </w:pPr>
             <w:r>
               <w:rPr>
-                <w:rStyle w:val="Cdigo-fonte"/>
+                <w:rStyle w:val="Cdigo-fonteuser"/>
                 <w:rFonts w:ascii="Google Sans Text;sans-serif" w:hAnsi="Google Sans Text;sans-serif"/>
                 <w:b/>
               </w:rPr>
@@ -2245,7 +1984,7 @@
           </w:tcPr>
           <w:p>
             <w:pPr>
-              <w:pStyle w:val="Contedodatabela"/>
+              <w:pStyle w:val="Contedodatabelauser"/>
               <w:spacing w:lineRule="auto" w:line="274" w:before="0" w:after="140"/>
               <w:ind w:hanging="0" w:start="0" w:end="0"/>
               <w:rPr/>
@@ -2258,7 +1997,7 @@
             </w:r>
             <w:r>
               <w:rPr>
-                <w:rStyle w:val="Cdigo-fonte"/>
+                <w:rStyle w:val="Cdigo-fonteuser"/>
                 <w:rFonts w:ascii="Google Sans Text;sans-serif" w:hAnsi="Google Sans Text;sans-serif"/>
               </w:rPr>
               <w:t>image-rendering</w:t>
@@ -2284,7 +2023,7 @@
           </w:tcPr>
           <w:p>
             <w:pPr>
-              <w:pStyle w:val="Contedodatabela"/>
+              <w:pStyle w:val="Contedodatabelauser"/>
               <w:spacing w:lineRule="auto" w:line="274" w:before="0" w:after="140"/>
               <w:ind w:hanging="0" w:start="0" w:end="0"/>
               <w:rPr>
@@ -2305,7 +2044,7 @@
     </w:tbl>
     <w:p>
       <w:pPr>
-        <w:pStyle w:val="Linhahorizontal"/>
+        <w:pStyle w:val="Linhahorizontaluser"/>
         <w:spacing w:before="0" w:after="160"/>
         <w:rPr>
           <w:sz w:val="24"/>
@@ -2419,7 +2158,7 @@
           </w:tcPr>
           <w:p>
             <w:pPr>
-              <w:pStyle w:val="Contedodatabela"/>
+              <w:pStyle w:val="Contedodatabelauser"/>
               <w:spacing w:lineRule="auto" w:line="274" w:before="0" w:after="0"/>
               <w:ind w:hanging="0" w:start="0" w:end="0"/>
               <w:rPr/>
@@ -2446,7 +2185,7 @@
           </w:tcPr>
           <w:p>
             <w:pPr>
-              <w:pStyle w:val="Contedodatabela"/>
+              <w:pStyle w:val="Contedodatabelauser"/>
               <w:spacing w:lineRule="auto" w:line="274" w:before="0" w:after="0"/>
               <w:ind w:hanging="0" w:start="0" w:end="0"/>
               <w:rPr/>
@@ -2473,7 +2212,7 @@
           </w:tcPr>
           <w:p>
             <w:pPr>
-              <w:pStyle w:val="Contedodatabela"/>
+              <w:pStyle w:val="Contedodatabelauser"/>
               <w:spacing w:lineRule="auto" w:line="274" w:before="0" w:after="0"/>
               <w:ind w:hanging="0" w:start="0" w:end="0"/>
               <w:rPr/>
@@ -2503,14 +2242,14 @@
           </w:tcPr>
           <w:p>
             <w:pPr>
-              <w:pStyle w:val="Contedodatabela"/>
+              <w:pStyle w:val="Contedodatabelauser"/>
               <w:spacing w:lineRule="auto" w:line="274" w:before="0" w:after="140"/>
               <w:ind w:hanging="0" w:start="0" w:end="0"/>
               <w:rPr/>
             </w:pPr>
             <w:r>
               <w:rPr>
-                <w:rStyle w:val="Cdigo-fonte"/>
+                <w:rStyle w:val="Cdigo-fonteuser"/>
                 <w:rFonts w:ascii="Google Sans Text;sans-serif" w:hAnsi="Google Sans Text;sans-serif"/>
                 <w:b/>
               </w:rPr>
@@ -2531,7 +2270,7 @@
           </w:tcPr>
           <w:p>
             <w:pPr>
-              <w:pStyle w:val="Contedodatabela"/>
+              <w:pStyle w:val="Contedodatabelauser"/>
               <w:spacing w:lineRule="auto" w:line="274" w:before="0" w:after="140"/>
               <w:ind w:hanging="0" w:start="0" w:end="0"/>
               <w:rPr>
@@ -2559,7 +2298,7 @@
           </w:tcPr>
           <w:p>
             <w:pPr>
-              <w:pStyle w:val="Contedodatabela"/>
+              <w:pStyle w:val="Contedodatabelauser"/>
               <w:spacing w:lineRule="auto" w:line="274" w:before="0" w:after="140"/>
               <w:ind w:hanging="0" w:start="0" w:end="0"/>
               <w:rPr>
@@ -2590,14 +2329,14 @@
           </w:tcPr>
           <w:p>
             <w:pPr>
-              <w:pStyle w:val="Contedodatabela"/>
+              <w:pStyle w:val="Contedodatabelauser"/>
               <w:spacing w:lineRule="auto" w:line="274" w:before="0" w:after="140"/>
               <w:ind w:hanging="0" w:start="0" w:end="0"/>
               <w:rPr/>
             </w:pPr>
             <w:r>
               <w:rPr>
-                <w:rStyle w:val="Cdigo-fonte"/>
+                <w:rStyle w:val="Cdigo-fonteuser"/>
                 <w:rFonts w:ascii="Google Sans Text;sans-serif" w:hAnsi="Google Sans Text;sans-serif"/>
                 <w:b/>
               </w:rPr>
@@ -2618,7 +2357,7 @@
           </w:tcPr>
           <w:p>
             <w:pPr>
-              <w:pStyle w:val="Contedodatabela"/>
+              <w:pStyle w:val="Contedodatabelauser"/>
               <w:spacing w:lineRule="auto" w:line="274" w:before="0" w:after="140"/>
               <w:ind w:hanging="0" w:start="0" w:end="0"/>
               <w:rPr/>
@@ -2631,7 +2370,7 @@
             </w:r>
             <w:r>
               <w:rPr>
-                <w:rStyle w:val="Cdigo-fonte"/>
+                <w:rStyle w:val="Cdigo-fonteuser"/>
                 <w:rFonts w:ascii="Google Sans Text;sans-serif" w:hAnsi="Google Sans Text;sans-serif"/>
               </w:rPr>
               <w:t>geopolitica.html</w:t>
@@ -2657,7 +2396,7 @@
           </w:tcPr>
           <w:p>
             <w:pPr>
-              <w:pStyle w:val="Contedodatabela"/>
+              <w:pStyle w:val="Contedodatabelauser"/>
               <w:spacing w:lineRule="auto" w:line="274" w:before="0" w:after="140"/>
               <w:ind w:hanging="0" w:start="0" w:end="0"/>
               <w:rPr>
@@ -2688,14 +2427,14 @@
           </w:tcPr>
           <w:p>
             <w:pPr>
-              <w:pStyle w:val="Contedodatabela"/>
+              <w:pStyle w:val="Contedodatabelauser"/>
               <w:spacing w:lineRule="auto" w:line="274" w:before="0" w:after="140"/>
               <w:ind w:hanging="0" w:start="0" w:end="0"/>
               <w:rPr/>
             </w:pPr>
             <w:r>
               <w:rPr>
-                <w:rStyle w:val="Cdigo-fonte"/>
+                <w:rStyle w:val="Cdigo-fonteuser"/>
                 <w:rFonts w:ascii="Google Sans Text;sans-serif" w:hAnsi="Google Sans Text;sans-serif"/>
                 <w:b/>
               </w:rPr>
@@ -2716,7 +2455,7 @@
           </w:tcPr>
           <w:p>
             <w:pPr>
-              <w:pStyle w:val="Contedodatabela"/>
+              <w:pStyle w:val="Contedodatabelauser"/>
               <w:spacing w:lineRule="auto" w:line="274" w:before="0" w:after="140"/>
               <w:ind w:hanging="0" w:start="0" w:end="0"/>
               <w:rPr>
@@ -2744,7 +2483,7 @@
           </w:tcPr>
           <w:p>
             <w:pPr>
-              <w:pStyle w:val="Contedodatabela"/>
+              <w:pStyle w:val="Contedodatabelauser"/>
               <w:spacing w:lineRule="auto" w:line="274" w:before="0" w:after="140"/>
               <w:ind w:hanging="0" w:start="0" w:end="0"/>
               <w:rPr>
@@ -2763,7 +2502,7 @@
     </w:tbl>
     <w:p>
       <w:pPr>
-        <w:pStyle w:val="Linhahorizontal"/>
+        <w:pStyle w:val="Linhahorizontaluser"/>
         <w:spacing w:before="0" w:after="160"/>
         <w:rPr>
           <w:sz w:val="24"/>
@@ -2846,7 +2585,7 @@
       </w:pPr>
       <w:r>
         <w:rPr>
-          <w:rStyle w:val="Cdigo-fonte"/>
+          <w:rStyle w:val="Cdigo-fonteuser"/>
           <w:rFonts w:ascii="Google Sans Text;sans-serif" w:hAnsi="Google Sans Text;sans-serif"/>
           <w:b/>
         </w:rPr>
@@ -2876,7 +2615,7 @@
       </w:pPr>
       <w:r>
         <w:rPr>
-          <w:rStyle w:val="Cdigo-fonte"/>
+          <w:rStyle w:val="Cdigo-fonteuser"/>
           <w:rFonts w:ascii="Google Sans Text;sans-serif" w:hAnsi="Google Sans Text;sans-serif"/>
           <w:b/>
         </w:rPr>
@@ -2906,7 +2645,7 @@
       </w:pPr>
       <w:r>
         <w:rPr>
-          <w:rStyle w:val="Cdigo-fonte"/>
+          <w:rStyle w:val="Cdigo-fonteuser"/>
           <w:rFonts w:ascii="Google Sans Text;sans-serif" w:hAnsi="Google Sans Text;sans-serif"/>
           <w:b/>
         </w:rPr>
@@ -2921,7 +2660,7 @@
     </w:p>
     <w:p>
       <w:pPr>
-        <w:pStyle w:val="Linhahorizontal"/>
+        <w:pStyle w:val="Linhahorizontaluser"/>
         <w:spacing w:before="0" w:after="160"/>
         <w:rPr>
           <w:sz w:val="24"/>
@@ -3048,7 +2787,7 @@
       </w:r>
       <w:r>
         <w:rPr>
-          <w:rStyle w:val="Cdigo-fonte"/>
+          <w:rStyle w:val="Cdigo-fonteuser"/>
           <w:rFonts w:ascii="Google Sans Text;sans-serif" w:hAnsi="Google Sans Text;sans-serif"/>
         </w:rPr>
         <w:t>duvid-ui.js</w:t>
@@ -3061,7 +2800,7 @@
       </w:r>
       <w:r>
         <w:rPr>
-          <w:rStyle w:val="Cdigo-fonte"/>
+          <w:rStyle w:val="Cdigo-fonteuser"/>
           <w:rFonts w:ascii="Google Sans Text;sans-serif" w:hAnsi="Google Sans Text;sans-serif"/>
         </w:rPr>
         <w:t>DuvidDB.salvarConclusao()</w:t>
@@ -3103,7 +2842,7 @@
       </w:r>
       <w:r>
         <w:rPr>
-          <w:rStyle w:val="Cdigo-fonte"/>
+          <w:rStyle w:val="Cdigo-fonteuser"/>
           <w:rFonts w:ascii="Google Sans Text;sans-serif" w:hAnsi="Google Sans Text;sans-serif"/>
         </w:rPr>
         <w:t>localStorage</w:t>
@@ -3145,7 +2884,7 @@
       </w:r>
       <w:r>
         <w:rPr>
-          <w:rStyle w:val="Cdigo-fonte"/>
+          <w:rStyle w:val="Cdigo-fonteuser"/>
           <w:rFonts w:ascii="Google Sans Text;sans-serif" w:hAnsi="Google Sans Text;sans-serif"/>
         </w:rPr>
         <w:t>gerarHtmlTrofeus()</w:t>
@@ -3277,7 +3016,7 @@
       </w:pPr>
       <w:r>
         <w:rPr>
-          <w:rStyle w:val="Cdigo-fonte"/>
+          <w:rStyle w:val="Cdigo-fonteuser"/>
           <w:b/>
         </w:rPr>
         <w:t>duvid-db.js</w:t>
@@ -3316,7 +3055,7 @@
       </w:r>
       <w:r>
         <w:rPr>
-          <w:rStyle w:val="Cdigo-fonte"/>
+          <w:rStyle w:val="Cdigo-fonteuser"/>
         </w:rPr>
         <w:t>localStorage</w:t>
       </w:r>
@@ -3352,7 +3091,7 @@
       </w:r>
       <w:r>
         <w:rPr>
-          <w:rStyle w:val="Cdigo-fonte"/>
+          <w:rStyle w:val="Cdigo-fonteuser"/>
         </w:rPr>
         <w:t>getGlobinhos()</w:t>
       </w:r>
@@ -3362,7 +3101,7 @@
       </w:r>
       <w:r>
         <w:rPr>
-          <w:rStyle w:val="Cdigo-fonte"/>
+          <w:rStyle w:val="Cdigo-fonteuser"/>
         </w:rPr>
         <w:t>addGlobinhos(pts)</w:t>
       </w:r>
@@ -3372,7 +3111,7 @@
       </w:r>
       <w:r>
         <w:rPr>
-          <w:rStyle w:val="Cdigo-fonte"/>
+          <w:rStyle w:val="Cdigo-fonteuser"/>
         </w:rPr>
         <w:t>salvarConclusao(id, tipo)</w:t>
       </w:r>
@@ -3382,7 +3121,7 @@
       </w:r>
       <w:r>
         <w:rPr>
-          <w:rStyle w:val="Cdigo-fonte"/>
+          <w:rStyle w:val="Cdigo-fonteuser"/>
         </w:rPr>
         <w:t>getProgressoRPG()</w:t>
       </w:r>
@@ -3418,7 +3157,7 @@
       </w:r>
       <w:r>
         <w:rPr>
-          <w:rStyle w:val="Cdigo-fonte"/>
+          <w:rStyle w:val="Cdigo-fonteuser"/>
         </w:rPr>
         <w:t>RANKING_SISTEMA</w:t>
       </w:r>
@@ -3444,7 +3183,7 @@
       </w:pPr>
       <w:r>
         <w:rPr>
-          <w:rStyle w:val="Cdigo-fonte"/>
+          <w:rStyle w:val="Cdigo-fonteuser"/>
           <w:b/>
         </w:rPr>
         <w:t>duvid-core.js</w:t>
@@ -3483,7 +3222,7 @@
       </w:r>
       <w:r>
         <w:rPr>
-          <w:rStyle w:val="Cdigo-fonte"/>
+          <w:rStyle w:val="Cdigo-fonteuser"/>
         </w:rPr>
         <w:t>DOMContentLoaded</w:t>
       </w:r>
@@ -3519,7 +3258,7 @@
       </w:r>
       <w:r>
         <w:rPr>
-          <w:rStyle w:val="Cdigo-fonte"/>
+          <w:rStyle w:val="Cdigo-fonteuser"/>
         </w:rPr>
         <w:t>verificarStatusAula(id)</w:t>
       </w:r>
@@ -3529,7 +3268,7 @@
       </w:r>
       <w:r>
         <w:rPr>
-          <w:rStyle w:val="Cdigo-fonte"/>
+          <w:rStyle w:val="Cdigo-fonteuser"/>
         </w:rPr>
         <w:t>gerenciarIdentificacaoHome()</w:t>
       </w:r>
@@ -3539,7 +3278,7 @@
       </w:r>
       <w:r>
         <w:rPr>
-          <w:rStyle w:val="Cdigo-fonte"/>
+          <w:rStyle w:val="Cdigo-fonteuser"/>
         </w:rPr>
         <w:t>executarReset()</w:t>
       </w:r>
@@ -3576,7 +3315,7 @@
     </w:p>
     <w:p>
       <w:pPr>
-        <w:pStyle w:val="Linhahorizontal"/>
+        <w:pStyle w:val="Linhahorizontaluser"/>
         <w:spacing w:before="0" w:after="80"/>
         <w:rPr>
           <w:sz w:val="24"/>
@@ -3642,7 +3381,7 @@
       </w:pPr>
       <w:r>
         <w:rPr>
-          <w:rStyle w:val="Cdigo-fonte"/>
+          <w:rStyle w:val="Cdigo-fonteuser"/>
           <w:b/>
         </w:rPr>
         <w:t>duvid-ui.js</w:t>
@@ -3707,7 +3446,7 @@
       </w:r>
       <w:r>
         <w:rPr>
-          <w:rStyle w:val="Cdigo-fonte"/>
+          <w:rStyle w:val="Cdigo-fonteuser"/>
         </w:rPr>
         <w:t>executarGatilhoResultado(correto, pts)</w:t>
       </w:r>
@@ -3733,7 +3472,7 @@
       </w:pPr>
       <w:r>
         <w:rPr>
-          <w:rStyle w:val="Cdigo-fonte"/>
+          <w:rStyle w:val="Cdigo-fonteuser"/>
         </w:rPr>
         <w:t>desenharTrilhaNiveis()</w:t>
       </w:r>
@@ -3759,7 +3498,7 @@
       </w:pPr>
       <w:r>
         <w:rPr>
-          <w:rStyle w:val="Cdigo-fonte"/>
+          <w:rStyle w:val="Cdigo-fonteuser"/>
         </w:rPr>
         <w:t>feedbackVisualAcerto()</w:t>
       </w:r>
@@ -3769,7 +3508,7 @@
       </w:r>
       <w:r>
         <w:rPr>
-          <w:rStyle w:val="Cdigo-fonte"/>
+          <w:rStyle w:val="Cdigo-fonteuser"/>
         </w:rPr>
         <w:t>feedbackVisualErro()</w:t>
       </w:r>
@@ -3795,7 +3534,7 @@
       </w:pPr>
       <w:r>
         <w:rPr>
-          <w:rStyle w:val="Cdigo-fonte"/>
+          <w:rStyle w:val="Cdigo-fonteuser"/>
         </w:rPr>
         <w:t>dispararComemoracao()</w:t>
       </w:r>
@@ -3821,7 +3560,7 @@
       </w:pPr>
       <w:r>
         <w:rPr>
-          <w:rStyle w:val="Cdigo-fonte"/>
+          <w:rStyle w:val="Cdigo-fonteuser"/>
           <w:b/>
         </w:rPr>
         <w:t>duvid-audio.js</w:t>
@@ -3886,7 +3625,7 @@
       </w:r>
       <w:r>
         <w:rPr>
-          <w:rStyle w:val="Cdigo-fonte"/>
+          <w:rStyle w:val="Cdigo-fonteuser"/>
         </w:rPr>
         <w:t>playSom('acerto'|'erro'|'click')</w:t>
       </w:r>
@@ -3896,7 +3635,7 @@
       </w:r>
       <w:r>
         <w:rPr>
-          <w:rStyle w:val="Cdigo-fonte"/>
+          <w:rStyle w:val="Cdigo-fonteuser"/>
         </w:rPr>
         <w:t>playSomFinal(aprovado)</w:t>
       </w:r>
@@ -3907,7 +3646,7 @@
     </w:p>
     <w:p>
       <w:pPr>
-        <w:pStyle w:val="Linhahorizontal"/>
+        <w:pStyle w:val="Linhahorizontaluser"/>
         <w:spacing w:before="0" w:after="80"/>
         <w:rPr>
           <w:sz w:val="24"/>
@@ -3973,7 +3712,7 @@
       </w:pPr>
       <w:r>
         <w:rPr>
-          <w:rStyle w:val="Cdigo-fonte"/>
+          <w:rStyle w:val="Cdigo-fonteuser"/>
           <w:b/>
         </w:rPr>
         <w:t>jstextos-padrao.js</w:t>
@@ -4038,7 +3777,7 @@
       </w:r>
       <w:r>
         <w:rPr>
-          <w:rStyle w:val="Cdigo-fonte"/>
+          <w:rStyle w:val="Cdigo-fonteuser"/>
         </w:rPr>
         <w:t>validarRadio()</w:t>
       </w:r>
@@ -4048,7 +3787,7 @@
       </w:r>
       <w:r>
         <w:rPr>
-          <w:rStyle w:val="Cdigo-fonte"/>
+          <w:rStyle w:val="Cdigo-fonteuser"/>
         </w:rPr>
         <w:t>ProcessarResposta()</w:t>
       </w:r>
@@ -4058,7 +3797,7 @@
       </w:r>
       <w:r>
         <w:rPr>
-          <w:rStyle w:val="Cdigo-fonte"/>
+          <w:rStyle w:val="Cdigo-fonteuser"/>
         </w:rPr>
         <w:t>mostraCinza()</w:t>
       </w:r>
@@ -4068,7 +3807,7 @@
       </w:r>
       <w:r>
         <w:rPr>
-          <w:rStyle w:val="Cdigo-fonte"/>
+          <w:rStyle w:val="Cdigo-fonteuser"/>
         </w:rPr>
         <w:t>injetarMetadadosAula()</w:t>
       </w:r>
@@ -4104,7 +3843,7 @@
       </w:r>
       <w:r>
         <w:rPr>
-          <w:rStyle w:val="Cdigo-fonte"/>
+          <w:rStyle w:val="Cdigo-fonteuser"/>
         </w:rPr>
         <w:t>executarGatilhoResultado</w:t>
       </w:r>
@@ -4130,7 +3869,7 @@
       </w:pPr>
       <w:r>
         <w:rPr>
-          <w:rStyle w:val="Cdigo-fonte"/>
+          <w:rStyle w:val="Cdigo-fonteuser"/>
           <w:b/>
         </w:rPr>
         <w:t>jsquestoes.js</w:t>
@@ -4195,7 +3934,7 @@
       </w:r>
       <w:r>
         <w:rPr>
-          <w:rStyle w:val="Cdigo-fonte"/>
+          <w:rStyle w:val="Cdigo-fonteuser"/>
         </w:rPr>
         <w:t>carregarDados(id)</w:t>
       </w:r>
@@ -4205,7 +3944,7 @@
       </w:r>
       <w:r>
         <w:rPr>
-          <w:rStyle w:val="Cdigo-fonte"/>
+          <w:rStyle w:val="Cdigo-fonteuser"/>
         </w:rPr>
         <w:t>renderizarQuestao()</w:t>
       </w:r>
@@ -4215,7 +3954,7 @@
       </w:r>
       <w:r>
         <w:rPr>
-          <w:rStyle w:val="Cdigo-fonte"/>
+          <w:rStyle w:val="Cdigo-fonteuser"/>
         </w:rPr>
         <w:t>verificar()</w:t>
       </w:r>
@@ -4225,7 +3964,7 @@
       </w:r>
       <w:r>
         <w:rPr>
-          <w:rStyle w:val="Cdigo-fonte"/>
+          <w:rStyle w:val="Cdigo-fonteuser"/>
         </w:rPr>
         <w:t>finalizar()</w:t>
       </w:r>
@@ -4236,7 +3975,7 @@
     </w:p>
     <w:p>
       <w:pPr>
-        <w:pStyle w:val="Linhahorizontal"/>
+        <w:pStyle w:val="Linhahorizontaluser"/>
         <w:spacing w:before="0" w:after="80"/>
         <w:rPr>
           <w:sz w:val="24"/>
@@ -4338,7 +4077,7 @@
       </w:r>
       <w:r>
         <w:rPr>
-          <w:rStyle w:val="Cdigo-fonte"/>
+          <w:rStyle w:val="Cdigo-fonteuser"/>
         </w:rPr>
         <w:t>_</w:t>
       </w:r>
@@ -4348,7 +4087,7 @@
       </w:r>
       <w:r>
         <w:rPr>
-          <w:rStyle w:val="Cdigo-fonte"/>
+          <w:rStyle w:val="Cdigo-fonteuser"/>
         </w:rPr>
         <w:t>_focarNivelAtual</w:t>
       </w:r>
@@ -4384,7 +4123,7 @@
       </w:r>
       <w:r>
         <w:rPr>
-          <w:rStyle w:val="Cdigo-fonte"/>
+          <w:rStyle w:val="Cdigo-fonteuser"/>
         </w:rPr>
         <w:t>duvid-ui.js</w:t>
       </w:r>
@@ -4420,7 +4159,7 @@
       </w:r>
       <w:r>
         <w:rPr>
-          <w:rStyle w:val="Cdigo-fonte"/>
+          <w:rStyle w:val="Cdigo-fonteuser"/>
         </w:rPr>
         <w:t>if (typeof ... === "function")</w:t>
       </w:r>
@@ -4431,7 +4170,7 @@
     </w:p>
     <w:p>
       <w:pPr>
-        <w:pStyle w:val="Linhahorizontal"/>
+        <w:pStyle w:val="Linhahorizontaluser"/>
         <w:spacing w:before="0" w:after="80"/>
         <w:rPr>
           <w:sz w:val="24"/>
@@ -4653,7 +4392,7 @@
       </w:pPr>
       <w:r>
         <w:rPr>
-          <w:rStyle w:val="Cdigo-fonte"/>
+          <w:rStyle w:val="Cdigo-fonteuser"/>
           <w:b/>
         </w:rPr>
         <w:t>artigos.json</w:t>
@@ -4686,7 +4425,7 @@
       </w:pPr>
       <w:r>
         <w:rPr>
-          <w:rStyle w:val="Cdigo-fonte"/>
+          <w:rStyle w:val="Cdigo-fonteuser"/>
           <w:b/>
         </w:rPr>
         <w:t>galeria.json</w:t>
@@ -4719,7 +4458,7 @@
       </w:pPr>
       <w:r>
         <w:rPr>
-          <w:rStyle w:val="Cdigo-fonte"/>
+          <w:rStyle w:val="Cdigo-fonteuser"/>
           <w:b/>
         </w:rPr>
         <w:t>scripts-blog.js</w:t>
@@ -4758,7 +4497,7 @@
       </w:r>
       <w:r>
         <w:rPr>
-          <w:rStyle w:val="Cdigo-fonte"/>
+          <w:rStyle w:val="Cdigo-fonteuser"/>
         </w:rPr>
         <w:t>blog.html</w:t>
       </w:r>
@@ -4794,7 +4533,7 @@
       </w:r>
       <w:r>
         <w:rPr>
-          <w:rStyle w:val="Cdigo-fonte"/>
+          <w:rStyle w:val="Cdigo-fonteuser"/>
         </w:rPr>
         <w:t>fetch()</w:t>
       </w:r>
@@ -4804,7 +4543,7 @@
       </w:r>
       <w:r>
         <w:rPr>
-          <w:rStyle w:val="Cdigo-fonte"/>
+          <w:rStyle w:val="Cdigo-fonteuser"/>
         </w:rPr>
         <w:t>Template Literals</w:t>
       </w:r>
@@ -4830,7 +4569,7 @@
       </w:pPr>
       <w:r>
         <w:rPr>
-          <w:rStyle w:val="Cdigo-fonte"/>
+          <w:rStyle w:val="Cdigo-fonteuser"/>
           <w:b/>
         </w:rPr>
         <w:t>blog-estilo.css</w:t>
@@ -4869,7 +4608,7 @@
       </w:r>
       <w:r>
         <w:rPr>
-          <w:rStyle w:val="Cdigo-fonte"/>
+          <w:rStyle w:val="Cdigo-fonteuser"/>
           <w:b/>
         </w:rPr>
         <w:t>/artigos</w:t>
@@ -4908,7 +4647,7 @@
       </w:r>
       <w:r>
         <w:rPr>
-          <w:rStyle w:val="Cdigo-fonte"/>
+          <w:rStyle w:val="Cdigo-fonteuser"/>
           <w:b/>
         </w:rPr>
         <w:t>/fotos</w:t>
@@ -5027,7 +4766,7 @@
       </w:pPr>
       <w:r>
         <w:rPr>
-          <w:rStyle w:val="Cdigo-fonte"/>
+          <w:rStyle w:val="Cdigo-fonteuser"/>
           <w:b/>
         </w:rPr>
         <w:t>NomeAlunos</w:t>
@@ -5038,7 +4777,7 @@
       </w:r>
       <w:r>
         <w:rPr>
-          <w:rStyle w:val="Cdigo-fonte"/>
+          <w:rStyle w:val="Cdigo-fonteuser"/>
         </w:rPr>
         <w:t>localStorage</w:t>
       </w:r>
@@ -5064,7 +4803,7 @@
       </w:pPr>
       <w:r>
         <w:rPr>
-          <w:rStyle w:val="Cdigo-fonte"/>
+          <w:rStyle w:val="Cdigo-fonteuser"/>
           <w:b/>
         </w:rPr>
         <w:t>exibirSaudacao</w:t>
@@ -5077,7 +4816,7 @@
       </w:r>
       <w:r>
         <w:rPr>
-          <w:rStyle w:val="Cdigo-fonte"/>
+          <w:rStyle w:val="Cdigo-fonteuser"/>
           <w:b/>
         </w:rPr>
         <w:t>resetarNome</w:t>
@@ -5104,7 +4843,7 @@
       </w:pPr>
       <w:r>
         <w:rPr>
-          <w:rStyle w:val="Cdigo-fonte"/>
+          <w:rStyle w:val="Cdigo-fonteuser"/>
           <w:b/>
         </w:rPr>
         <w:t>injetarMetadadosAula</w:t>
@@ -5115,7 +4854,7 @@
       </w:r>
       <w:r>
         <w:rPr>
-          <w:rStyle w:val="Cdigo-fonte"/>
+          <w:rStyle w:val="Cdigo-fonteuser"/>
         </w:rPr>
         <w:t>&lt;h1&gt;</w:t>
       </w:r>
@@ -5125,7 +4864,7 @@
       </w:r>
       <w:r>
         <w:rPr>
-          <w:rStyle w:val="Cdigo-fonte"/>
+          <w:rStyle w:val="Cdigo-fonteuser"/>
         </w:rPr>
         <w:t>&lt;title&gt;</w:t>
       </w:r>
@@ -5175,7 +4914,7 @@
       </w:pPr>
       <w:r>
         <w:rPr>
-          <w:rStyle w:val="Cdigo-fonte"/>
+          <w:rStyle w:val="Cdigo-fonteuser"/>
           <w:b/>
         </w:rPr>
         <w:t>ProcessarResposta</w:t>
@@ -5202,7 +4941,7 @@
       </w:pPr>
       <w:r>
         <w:rPr>
-          <w:rStyle w:val="Cdigo-fonte"/>
+          <w:rStyle w:val="Cdigo-fonteuser"/>
           <w:b/>
         </w:rPr>
         <w:t>validarRadio</w:t>
@@ -5229,7 +4968,7 @@
       </w:pPr>
       <w:r>
         <w:rPr>
-          <w:rStyle w:val="Cdigo-fonte"/>
+          <w:rStyle w:val="Cdigo-fonteuser"/>
           <w:b/>
         </w:rPr>
         <w:t>feedbackVisualAcerto</w:t>
@@ -5256,7 +4995,7 @@
       </w:pPr>
       <w:r>
         <w:rPr>
-          <w:rStyle w:val="Cdigo-fonte"/>
+          <w:rStyle w:val="Cdigo-fonteuser"/>
           <w:b/>
         </w:rPr>
         <w:t>Play</w:t>
@@ -5267,7 +5006,7 @@
       </w:r>
       <w:r>
         <w:rPr>
-          <w:rStyle w:val="Cdigo-fonte"/>
+          <w:rStyle w:val="Cdigo-fonteuser"/>
         </w:rPr>
         <w:t>/audios/</w:t>
       </w:r>
@@ -5317,7 +5056,7 @@
       </w:pPr>
       <w:r>
         <w:rPr>
-          <w:rStyle w:val="Cdigo-fonte"/>
+          <w:rStyle w:val="Cdigo-fonteuser"/>
           <w:b/>
         </w:rPr>
         <w:t>MostrarProximo</w:t>
@@ -5354,7 +5093,7 @@
       </w:pPr>
       <w:r>
         <w:rPr>
-          <w:rStyle w:val="Cdigo-fonte"/>
+          <w:rStyle w:val="Cdigo-fonteuser"/>
           <w:b/>
         </w:rPr>
         <w:t>addProgressBar</w:t>
@@ -5365,7 +5104,7 @@
       </w:r>
       <w:r>
         <w:rPr>
-          <w:rStyle w:val="Cdigo-fonte"/>
+          <w:rStyle w:val="Cdigo-fonteuser"/>
         </w:rPr>
         <w:t>.topico</w:t>
       </w:r>
@@ -5415,7 +5154,7 @@
       </w:pPr>
       <w:r>
         <w:rPr>
-          <w:rStyle w:val="Cdigo-fonte"/>
+          <w:rStyle w:val="Cdigo-fonteuser"/>
           <w:b/>
         </w:rPr>
         <w:t>mostraCinza</w:t>
@@ -5442,7 +5181,7 @@
       </w:pPr>
       <w:r>
         <w:rPr>
-          <w:rStyle w:val="Cdigo-fonte"/>
+          <w:rStyle w:val="Cdigo-fonteuser"/>
           <w:b/>
         </w:rPr>
         <w:t>desativarBotoes</w:t>
@@ -5455,7 +5194,7 @@
       </w:r>
       <w:r>
         <w:rPr>
-          <w:rStyle w:val="Cdigo-fonte"/>
+          <w:rStyle w:val="Cdigo-fonteuser"/>
           <w:b/>
         </w:rPr>
         <w:t>desativarTextos</w:t>
@@ -5468,7 +5207,7 @@
       </w:r>
       <w:r>
         <w:rPr>
-          <w:rStyle w:val="Cdigo-fonte"/>
+          <w:rStyle w:val="Cdigo-fonteuser"/>
           <w:b/>
         </w:rPr>
         <w:t>desativarImagens</w:t>
@@ -5495,7 +5234,7 @@
       </w:pPr>
       <w:r>
         <w:rPr>
-          <w:rStyle w:val="Cdigo-fonte"/>
+          <w:rStyle w:val="Cdigo-fonteuser"/>
           <w:b/>
         </w:rPr>
         <w:t>mostrarNota</w:t>
@@ -5506,7 +5245,7 @@
       </w:r>
       <w:r>
         <w:rPr>
-          <w:rStyle w:val="Cdigo-fonte"/>
+          <w:rStyle w:val="Cdigo-fonteuser"/>
         </w:rPr>
         <w:t>id01</w:t>
       </w:r>
@@ -5517,7 +5256,7 @@
     </w:p>
     <w:p>
       <w:pPr>
-        <w:pStyle w:val="Linhahorizontal"/>
+        <w:pStyle w:val="Linhahorizontaluser"/>
         <w:spacing w:before="0" w:after="160"/>
         <w:rPr/>
       </w:pPr>
@@ -5540,7 +5279,7 @@
     </w:p>
     <w:p>
       <w:pPr>
-        <w:pStyle w:val="Blocodecitao"/>
+        <w:pStyle w:val="Blocodecitaouser"/>
         <w:spacing w:before="0" w:after="160"/>
         <w:rPr/>
       </w:pPr>
@@ -5556,7 +5295,7 @@
       </w:r>
       <w:r>
         <w:rPr>
-          <w:rStyle w:val="Cdigo-fonte"/>
+          <w:rStyle w:val="Cdigo-fonteuser"/>
         </w:rPr>
         <w:t>localStorage</w:t>
       </w:r>
@@ -5566,7 +5305,7 @@
       </w:r>
       <w:r>
         <w:rPr>
-          <w:rStyle w:val="Cdigo-fonte"/>
+          <w:rStyle w:val="Cdigo-fonteuser"/>
         </w:rPr>
         <w:t>concluido_3ano/Textos3/Texto01/tt1.html</w:t>
       </w:r>
@@ -5658,7 +5397,7 @@
       </w:pPr>
       <w:r>
         <w:rPr>
-          <w:rStyle w:val="Cdigo-fonte"/>
+          <w:rStyle w:val="Cdigo-fonteuser"/>
           <w:b/>
         </w:rPr>
         <w:t>carregarAulas(ano)</w:t>
@@ -5669,7 +5408,7 @@
       </w:r>
       <w:r>
         <w:rPr>
-          <w:rStyle w:val="Cdigo-fonte"/>
+          <w:rStyle w:val="Cdigo-fonteuser"/>
         </w:rPr>
         <w:t>fetch</w:t>
       </w:r>
@@ -5705,7 +5444,7 @@
       </w:r>
       <w:r>
         <w:rPr>
-          <w:rStyle w:val="Cdigo-fonte"/>
+          <w:rStyle w:val="Cdigo-fonteuser"/>
         </w:rPr>
         <w:t>map</w:t>
       </w:r>
@@ -5715,7 +5454,7 @@
       </w:r>
       <w:r>
         <w:rPr>
-          <w:rStyle w:val="Cdigo-fonte"/>
+          <w:rStyle w:val="Cdigo-fonteuser"/>
         </w:rPr>
         <w:t>localStorage</w:t>
       </w:r>
@@ -5791,7 +5530,7 @@
       </w:pPr>
       <w:r>
         <w:rPr>
-          <w:rStyle w:val="Cdigo-fonte"/>
+          <w:rStyle w:val="Cdigo-fonteuser"/>
           <w:b/>
         </w:rPr>
         <w:t>mostrarProgressoGlobal(aulas, ano)</w:t>
@@ -5838,7 +5577,7 @@
       </w:r>
       <w:r>
         <w:rPr>
-          <w:rStyle w:val="Cdigo-fonte"/>
+          <w:rStyle w:val="Cdigo-fonteuser"/>
         </w:rPr>
         <w:t>transition: width 1s</w:t>
       </w:r>
@@ -5888,7 +5627,7 @@
       </w:pPr>
       <w:r>
         <w:rPr>
-          <w:rStyle w:val="Cdigo-fonte"/>
+          <w:rStyle w:val="Cdigo-fonteuser"/>
           <w:b/>
         </w:rPr>
         <w:t>atualizarResumoHome()</w:t>
@@ -5925,7 +5664,7 @@
       </w:r>
       <w:r>
         <w:rPr>
-          <w:rStyle w:val="Cdigo-fonte"/>
+          <w:rStyle w:val="Cdigo-fonteuser"/>
         </w:rPr>
         <w:t>notaFinal.mp3</w:t>
       </w:r>
@@ -5975,7 +5714,7 @@
       </w:pPr>
       <w:r>
         <w:rPr>
-          <w:rStyle w:val="Cdigo-fonte"/>
+          <w:rStyle w:val="Cdigo-fonteuser"/>
           <w:b/>
         </w:rPr>
         <w:t>ExpandeDiv</w:t>
@@ -6002,7 +5741,7 @@
       </w:pPr>
       <w:r>
         <w:rPr>
-          <w:rStyle w:val="Cdigo-fonte"/>
+          <w:rStyle w:val="Cdigo-fonteuser"/>
           <w:b/>
         </w:rPr>
         <w:t>window.onclick</w:t>
@@ -6014,7 +5753,7 @@
     </w:p>
     <w:p>
       <w:pPr>
-        <w:pStyle w:val="Linhahorizontal"/>
+        <w:pStyle w:val="Linhahorizontaluser"/>
         <w:spacing w:before="0" w:after="160"/>
         <w:rPr/>
       </w:pPr>
@@ -6037,7 +5776,7 @@
     </w:p>
     <w:p>
       <w:pPr>
-        <w:pStyle w:val="Blocodecitao"/>
+        <w:pStyle w:val="Blocodecitaouser"/>
         <w:spacing w:before="0" w:after="160"/>
         <w:rPr/>
       </w:pPr>
@@ -6136,7 +5875,7 @@
       </w:pPr>
       <w:r>
         <w:rPr>
-          <w:rStyle w:val="Cdigo-fonte"/>
+          <w:rStyle w:val="Cdigo-fonteuser"/>
           <w:b/>
         </w:rPr>
         <w:t>injetarComponentesGlobais</w:t>
@@ -6147,7 +5886,7 @@
       </w:r>
       <w:r>
         <w:rPr>
-          <w:rStyle w:val="Cdigo-fonte"/>
+          <w:rStyle w:val="Cdigo-fonteuser"/>
         </w:rPr>
         <w:t>fetch</w:t>
       </w:r>
@@ -6157,7 +5896,7 @@
       </w:r>
       <w:r>
         <w:rPr>
-          <w:rStyle w:val="Cdigo-fonte"/>
+          <w:rStyle w:val="Cdigo-fonteuser"/>
         </w:rPr>
         <w:t>header.html</w:t>
       </w:r>
@@ -6167,7 +5906,7 @@
       </w:r>
       <w:r>
         <w:rPr>
-          <w:rStyle w:val="Cdigo-fonte"/>
+          <w:rStyle w:val="Cdigo-fonteuser"/>
         </w:rPr>
         <w:t>footer.html</w:t>
       </w:r>
@@ -6213,7 +5952,7 @@
       </w:r>
       <w:r>
         <w:rPr>
-          <w:rStyle w:val="Cdigo-fonte"/>
+          <w:rStyle w:val="Cdigo-fonteuser"/>
         </w:rPr>
         <w:t>verificarSeEhAula()</w:t>
       </w:r>
@@ -6259,7 +5998,7 @@
       </w:r>
       <w:r>
         <w:rPr>
-          <w:rStyle w:val="Cdigo-fonte"/>
+          <w:rStyle w:val="Cdigo-fonteuser"/>
         </w:rPr>
         <w:t>notaFixa</w:t>
       </w:r>
@@ -6315,7 +6054,7 @@
       </w:r>
       <w:r>
         <w:rPr>
-          <w:rStyle w:val="Cdigo-fonte"/>
+          <w:rStyle w:val="Cdigo-fonteuser"/>
           <w:b/>
         </w:rPr>
         <w:t>inicializarControleFonte</w:t>
@@ -6332,7 +6071,7 @@
       </w:r>
       <w:r>
         <w:rPr>
-          <w:rStyle w:val="Cdigo-fonte"/>
+          <w:rStyle w:val="Cdigo-fonteuser"/>
         </w:rPr>
         <w:t>localStorage</w:t>
       </w:r>
@@ -6364,7 +6103,7 @@
       </w:r>
       <w:r>
         <w:rPr>
-          <w:rStyle w:val="Cdigo-fonte"/>
+          <w:rStyle w:val="Cdigo-fonteuser"/>
           <w:b/>
         </w:rPr>
         <w:t>Dark Mode</w:t>
@@ -6381,7 +6120,7 @@
       </w:r>
       <w:r>
         <w:rPr>
-          <w:rStyle w:val="Cdigo-fonte"/>
+          <w:rStyle w:val="Cdigo-fonteuser"/>
         </w:rPr>
         <w:t>body</w:t>
       </w:r>
@@ -6441,7 +6180,7 @@
       </w:r>
       <w:r>
         <w:rPr>
-          <w:rStyle w:val="Cdigo-fonte"/>
+          <w:rStyle w:val="Cdigo-fonteuser"/>
         </w:rPr>
         <w:t>window.onscroll</w:t>
       </w:r>
@@ -6467,7 +6206,7 @@
       </w:pPr>
       <w:r>
         <w:rPr>
-          <w:rStyle w:val="Cdigo-fonte"/>
+          <w:rStyle w:val="Cdigo-fonteuser"/>
           <w:b/>
         </w:rPr>
         <w:t>voltarAoTopo</w:t>
@@ -6527,7 +6266,7 @@
       </w:r>
       <w:r>
         <w:rPr>
-          <w:rStyle w:val="Cdigo-fonte"/>
+          <w:rStyle w:val="Cdigo-fonteuser"/>
         </w:rPr>
         <w:t>ano-atual</w:t>
       </w:r>
@@ -6537,7 +6276,7 @@
       </w:r>
       <w:r>
         <w:rPr>
-          <w:rStyle w:val="Cdigo-fonte"/>
+          <w:rStyle w:val="Cdigo-fonteuser"/>
         </w:rPr>
         <w:t>new Date().getFullYear()</w:t>
       </w:r>
@@ -6548,7 +6287,7 @@
     </w:p>
     <w:p>
       <w:pPr>
-        <w:pStyle w:val="Linhahorizontal"/>
+        <w:pStyle w:val="Linhahorizontaluser"/>
         <w:spacing w:before="0" w:after="160"/>
         <w:rPr/>
       </w:pPr>
@@ -6571,7 +6310,7 @@
     </w:p>
     <w:p>
       <w:pPr>
-        <w:pStyle w:val="Blocodecitao"/>
+        <w:pStyle w:val="Blocodecitaouser"/>
         <w:spacing w:before="0" w:after="160"/>
         <w:rPr/>
       </w:pPr>
@@ -6587,7 +6326,7 @@
       </w:r>
       <w:r>
         <w:rPr>
-          <w:rStyle w:val="Cdigo-fonte"/>
+          <w:rStyle w:val="Cdigo-fonteuser"/>
         </w:rPr>
         <w:t>async/await</w:t>
       </w:r>
@@ -6597,7 +6336,7 @@
       </w:r>
       <w:r>
         <w:rPr>
-          <w:rStyle w:val="Cdigo-fonte"/>
+          <w:rStyle w:val="Cdigo-fonteuser"/>
         </w:rPr>
         <w:t>defer</w:t>
       </w:r>
@@ -6607,7 +6346,7 @@
       </w:r>
       <w:r>
         <w:rPr>
-          <w:rStyle w:val="Cdigo-fonte"/>
+          <w:rStyle w:val="Cdigo-fonteuser"/>
         </w:rPr>
         <w:t>DOMContentLoaded</w:t>
       </w:r>
@@ -6681,7 +6420,7 @@
       </w:r>
       <w:r>
         <w:rPr>
-          <w:rStyle w:val="Cdigo-fonte"/>
+          <w:rStyle w:val="Cdigo-fonteuser"/>
           <w:b/>
         </w:rPr>
         <w:t>container-login</w:t>
@@ -6698,7 +6437,7 @@
       </w:r>
       <w:r>
         <w:rPr>
-          <w:rStyle w:val="Cdigo-fonte"/>
+          <w:rStyle w:val="Cdigo-fonteuser"/>
         </w:rPr>
         <w:t>jstextos-padrao.js</w:t>
       </w:r>
@@ -6708,7 +6447,7 @@
       </w:r>
       <w:r>
         <w:rPr>
-          <w:rStyle w:val="Cdigo-fonte"/>
+          <w:rStyle w:val="Cdigo-fonteuser"/>
         </w:rPr>
         <w:t>head</w:t>
       </w:r>
@@ -6744,7 +6483,7 @@
       </w:r>
       <w:r>
         <w:rPr>
-          <w:rStyle w:val="Cdigo-fonte"/>
+          <w:rStyle w:val="Cdigo-fonteuser"/>
         </w:rPr>
         <w:t>localStorage</w:t>
       </w:r>
@@ -6754,7 +6493,7 @@
       </w:r>
       <w:r>
         <w:rPr>
-          <w:rStyle w:val="Cdigo-fonte"/>
+          <w:rStyle w:val="Cdigo-fonteuser"/>
         </w:rPr>
         <w:t>nomeEstudante</w:t>
       </w:r>
@@ -6777,7 +6516,7 @@
       </w:r>
       <w:r>
         <w:rPr>
-          <w:rStyle w:val="Cdigo-fonte"/>
+          <w:rStyle w:val="Cdigo-fonteuser"/>
         </w:rPr>
         <w:t>resumo-geral</w:t>
       </w:r>
@@ -6824,7 +6563,7 @@
       </w:r>
       <w:r>
         <w:rPr>
-          <w:rStyle w:val="Cdigo-fonte"/>
+          <w:rStyle w:val="Cdigo-fonteuser"/>
         </w:rPr>
         <w:t>atualizarResumoHome()</w:t>
       </w:r>
@@ -6886,7 +6625,7 @@
       </w:r>
       <w:r>
         <w:rPr>
-          <w:rStyle w:val="Cdigo-fonte"/>
+          <w:rStyle w:val="Cdigo-fonteuser"/>
         </w:rPr>
         <w:t>fa-trophy</w:t>
       </w:r>
@@ -6896,7 +6635,7 @@
       </w:r>
       <w:r>
         <w:rPr>
-          <w:rStyle w:val="Cdigo-fonte"/>
+          <w:rStyle w:val="Cdigo-fonteuser"/>
         </w:rPr>
         <w:t>w3-animate-zoom</w:t>
       </w:r>
@@ -6956,7 +6695,7 @@
       </w:r>
       <w:r>
         <w:rPr>
-          <w:rStyle w:val="Cdigo-fonte"/>
+          <w:rStyle w:val="Cdigo-fonteuser"/>
         </w:rPr>
         <w:t>carregarFrase()</w:t>
       </w:r>
@@ -6966,7 +6705,7 @@
       </w:r>
       <w:r>
         <w:rPr>
-          <w:rStyle w:val="Cdigo-fonte"/>
+          <w:rStyle w:val="Cdigo-fonteuser"/>
         </w:rPr>
         <w:t>fetch</w:t>
       </w:r>
@@ -6976,7 +6715,7 @@
       </w:r>
       <w:r>
         <w:rPr>
-          <w:rStyle w:val="Cdigo-fonte"/>
+          <w:rStyle w:val="Cdigo-fonteuser"/>
         </w:rPr>
         <w:t>frases.json</w:t>
       </w:r>
@@ -7012,7 +6751,7 @@
       </w:r>
       <w:r>
         <w:rPr>
-          <w:rStyle w:val="Cdigo-fonte"/>
+          <w:rStyle w:val="Cdigo-fonteuser"/>
         </w:rPr>
         <w:t>setInterval</w:t>
       </w:r>
@@ -7022,7 +6761,7 @@
       </w:r>
       <w:r>
         <w:rPr>
-          <w:rStyle w:val="Cdigo-fonte"/>
+          <w:rStyle w:val="Cdigo-fonteuser"/>
         </w:rPr>
         <w:t>opacity</w:t>
       </w:r>
@@ -7071,7 +6810,7 @@
       </w:r>
       <w:r>
         <w:rPr>
-          <w:rStyle w:val="Cdigo-fonte"/>
+          <w:rStyle w:val="Cdigo-fonteuser"/>
         </w:rPr>
         <w:t>carregar.js</w:t>
       </w:r>
@@ -7107,7 +6846,7 @@
       </w:r>
       <w:r>
         <w:rPr>
-          <w:rStyle w:val="Cdigo-fonte"/>
+          <w:rStyle w:val="Cdigo-fonteuser"/>
         </w:rPr>
         <w:t>verificarSeEhAula()</w:t>
       </w:r>
@@ -7256,7 +6995,7 @@
       </w:r>
       <w:r>
         <w:rPr>
-          <w:rStyle w:val="Cdigo-fonteuser"/>
+          <w:rStyle w:val="Cdigo-fonte"/>
         </w:rPr>
         <w:t>id: 1</w:t>
       </w:r>
@@ -7266,7 +7005,7 @@
       </w:r>
       <w:r>
         <w:rPr>
-          <w:rStyle w:val="Cdigo-fonteuser"/>
+          <w:rStyle w:val="Cdigo-fonte"/>
         </w:rPr>
         <w:t>id: 10</w:t>
       </w:r>
@@ -7302,7 +7041,7 @@
       </w:r>
       <w:r>
         <w:rPr>
-          <w:rStyle w:val="Cdigo-fonteuser"/>
+          <w:rStyle w:val="Cdigo-fonte"/>
         </w:rPr>
         <w:t>102_q1.png</w:t>
       </w:r>
@@ -7882,7 +7621,7 @@
       </w:r>
       <w:r>
         <w:rPr>
-          <w:rStyle w:val="Cdigo-fonteuser"/>
+          <w:rStyle w:val="Cdigo-fonte"/>
         </w:rPr>
         <w:t>"imagem_apoio": ""</w:t>
       </w:r>
@@ -7892,7 +7631,7 @@
       </w:r>
       <w:r>
         <w:rPr>
-          <w:rStyle w:val="Cdigo-fonteuser"/>
+          <w:rStyle w:val="Cdigo-fonte"/>
         </w:rPr>
         <w:t>null</w:t>
       </w:r>
@@ -7902,7 +7641,7 @@
       </w:r>
       <w:r>
         <w:rPr>
-          <w:rStyle w:val="Cdigo-fonteuser"/>
+          <w:rStyle w:val="Cdigo-fonte"/>
         </w:rPr>
         <w:t>undefined</w:t>
       </w:r>
@@ -7948,7 +7687,7 @@
       </w:r>
       <w:r>
         <w:rPr>
-          <w:rStyle w:val="Cdigo-fonteuser"/>
+          <w:rStyle w:val="Cdigo-fonte"/>
         </w:rPr>
         <w:t>onerror="this.style.display='none'"</w:t>
       </w:r>
@@ -9841,7 +9580,7 @@
       </w:r>
       <w:r>
         <w:rPr>
-          <w:rStyle w:val="Cdigo-fonte"/>
+          <w:rStyle w:val="Cdigo-fonteuser"/>
         </w:rPr>
         <w:t>DuvidDB</w:t>
       </w:r>
@@ -9851,7 +9590,7 @@
       </w:r>
       <w:r>
         <w:rPr>
-          <w:rStyle w:val="Cdigo-fonte"/>
+          <w:rStyle w:val="Cdigo-fonteuser"/>
         </w:rPr>
         <w:t>localStorage</w:t>
       </w:r>
@@ -9861,7 +9600,7 @@
       </w:r>
       <w:r>
         <w:rPr>
-          <w:rStyle w:val="Cdigo-fonte"/>
+          <w:rStyle w:val="Cdigo-fonteuser"/>
         </w:rPr>
         <w:t>getGlobinhos()</w:t>
       </w:r>
@@ -9871,7 +9610,7 @@
       </w:r>
       <w:r>
         <w:rPr>
-          <w:rStyle w:val="Cdigo-fonte"/>
+          <w:rStyle w:val="Cdigo-fonteuser"/>
         </w:rPr>
         <w:t>addGlobinhos(n)</w:t>
       </w:r>
@@ -9881,7 +9620,7 @@
       </w:r>
       <w:r>
         <w:rPr>
-          <w:rStyle w:val="Cdigo-fonte"/>
+          <w:rStyle w:val="Cdigo-fonteuser"/>
         </w:rPr>
         <w:t>salvarConclusao(id, tipo)</w:t>
       </w:r>
@@ -9891,7 +9630,7 @@
       </w:r>
       <w:r>
         <w:rPr>
-          <w:rStyle w:val="Cdigo-fonte"/>
+          <w:rStyle w:val="Cdigo-fonteuser"/>
         </w:rPr>
         <w:t>getNome()</w:t>
       </w:r>
@@ -9927,7 +9666,7 @@
       </w:r>
       <w:r>
         <w:rPr>
-          <w:rStyle w:val="Cdigo-fonte"/>
+          <w:rStyle w:val="Cdigo-fonteuser"/>
         </w:rPr>
         <w:t>ModeloCss.css</w:t>
       </w:r>
@@ -9937,7 +9676,7 @@
       </w:r>
       <w:r>
         <w:rPr>
-          <w:rStyle w:val="Cdigo-fonte"/>
+          <w:rStyle w:val="Cdigo-fonteuser"/>
         </w:rPr>
         <w:t>w3-top</w:t>
       </w:r>
@@ -9947,7 +9686,7 @@
       </w:r>
       <w:r>
         <w:rPr>
-          <w:rStyle w:val="Cdigo-fonte"/>
+          <w:rStyle w:val="Cdigo-fonteuser"/>
         </w:rPr>
         <w:t>body</w:t>
       </w:r>
@@ -9999,7 +9738,7 @@
       </w:pPr>
       <w:r>
         <w:rPr>
-          <w:rStyle w:val="Cdigo-fonte"/>
+          <w:rStyle w:val="Cdigo-fonteuser"/>
         </w:rPr>
         <w:t>#saldoTotalHeader</w:t>
       </w:r>
@@ -10009,7 +9748,7 @@
       </w:r>
       <w:r>
         <w:rPr>
-          <w:rStyle w:val="Cdigo-fonte"/>
+          <w:rStyle w:val="Cdigo-fonteuser"/>
         </w:rPr>
         <w:t>.caixa-total-dourada</w:t>
       </w:r>
@@ -10035,7 +9774,7 @@
       </w:pPr>
       <w:r>
         <w:rPr>
-          <w:rStyle w:val="Cdigo-fonte"/>
+          <w:rStyle w:val="Cdigo-fonteuser"/>
         </w:rPr>
         <w:t>#notaFixa</w:t>
       </w:r>
@@ -10061,7 +9800,7 @@
       </w:pPr>
       <w:r>
         <w:rPr>
-          <w:rStyle w:val="Cdigo-fonte"/>
+          <w:rStyle w:val="Cdigo-fonteuser"/>
         </w:rPr>
         <w:t>#painel-pontos</w:t>
       </w:r>
@@ -10097,7 +9836,7 @@
       </w:r>
       <w:r>
         <w:rPr>
-          <w:rStyle w:val="Cdigo-fonte"/>
+          <w:rStyle w:val="Cdigo-fonteuser"/>
         </w:rPr>
         <w:t>?id=XXX</w:t>
       </w:r>
@@ -10107,7 +9846,7 @@
       </w:r>
       <w:r>
         <w:rPr>
-          <w:rStyle w:val="Cdigo-fonte"/>
+          <w:rStyle w:val="Cdigo-fonteuser"/>
         </w:rPr>
         <w:t>aulaID = new URLSearchParams(window.location.search).get('id')</w:t>
       </w:r>
@@ -10143,7 +9882,7 @@
       </w:r>
       <w:r>
         <w:rPr>
-          <w:rStyle w:val="Cdigo-fonte"/>
+          <w:rStyle w:val="Cdigo-fonteuser"/>
         </w:rPr>
         <w:t>atualizarGlobinhosGeral()</w:t>
       </w:r>
@@ -10153,7 +9892,7 @@
       </w:r>
       <w:r>
         <w:rPr>
-          <w:rStyle w:val="Cdigo-fonte"/>
+          <w:rStyle w:val="Cdigo-fonteuser"/>
         </w:rPr>
         <w:t>duvid-core.js</w:t>
       </w:r>
@@ -10163,7 +9902,7 @@
       </w:r>
       <w:r>
         <w:rPr>
-          <w:rStyle w:val="Cdigo-fonte"/>
+          <w:rStyle w:val="Cdigo-fonteuser"/>
         </w:rPr>
         <w:t>#saldoTotalHeader</w:t>
       </w:r>
@@ -10173,7 +9912,7 @@
       </w:r>
       <w:r>
         <w:rPr>
-          <w:rStyle w:val="Cdigo-fonte"/>
+          <w:rStyle w:val="Cdigo-fonteuser"/>
         </w:rPr>
         <w:t>#valor-total-central</w:t>
       </w:r>
@@ -10209,7 +9948,7 @@
       </w:r>
       <w:r>
         <w:rPr>
-          <w:rStyle w:val="Cdigo-fonte"/>
+          <w:rStyle w:val="Cdigo-fonteuser"/>
         </w:rPr>
         <w:t>finalizar()</w:t>
       </w:r>
@@ -10348,7 +10087,7 @@
       </w:r>
       <w:r>
         <w:rPr>
-          <w:rStyle w:val="Cdigo-fonte"/>
+          <w:rStyle w:val="Cdigo-fonteuser"/>
         </w:rPr>
         <w:t>Ctrl + H</w:t>
       </w:r>
@@ -10388,7 +10127,7 @@
       </w:r>
       <w:r>
         <w:rPr>
-          <w:rStyle w:val="Cdigo-fonte"/>
+          <w:rStyle w:val="Cdigo-fonteuser"/>
           <w:b/>
         </w:rPr>
         <w:t>.*</w:t>
@@ -10399,7 +10138,7 @@
       </w:r>
       <w:r>
         <w:rPr>
-          <w:rStyle w:val="Cdigo-fonte"/>
+          <w:rStyle w:val="Cdigo-fonteuser"/>
         </w:rPr>
         <w:t>Alt + R</w:t>
       </w:r>
@@ -10449,7 +10188,7 @@
       </w:r>
       <w:r>
         <w:rPr>
-          <w:rStyle w:val="Cdigo-fonte"/>
+          <w:rStyle w:val="Cdigo-fonteuser"/>
         </w:rPr>
         <w:t>"([a-e])[\)\.\-\s]+</w:t>
       </w:r>
@@ -10485,7 +10224,7 @@
       </w:r>
       <w:r>
         <w:rPr>
-          <w:rStyle w:val="Cdigo-fonte"/>
+          <w:rStyle w:val="Cdigo-fonteuser"/>
         </w:rPr>
         <w:t>"</w:t>
       </w:r>
@@ -10522,7 +10261,7 @@
     </w:p>
     <w:p>
       <w:pPr>
-        <w:pStyle w:val="Linhahorizontal"/>
+        <w:pStyle w:val="Linhahorizontaluser"/>
         <w:spacing w:before="0" w:after="160"/>
         <w:rPr>
           <w:sz w:val="24"/>
@@ -10588,7 +10327,7 @@
       </w:pPr>
       <w:r>
         <w:rPr>
-          <w:rStyle w:val="Cdigo-fonte"/>
+          <w:rStyle w:val="Cdigo-fonteuser"/>
         </w:rPr>
         <w:t>"</w:t>
       </w:r>
@@ -10614,7 +10353,7 @@
       </w:pPr>
       <w:r>
         <w:rPr>
-          <w:rStyle w:val="Cdigo-fonte"/>
+          <w:rStyle w:val="Cdigo-fonteuser"/>
         </w:rPr>
         <w:t>([a-e])</w:t>
       </w:r>
@@ -10640,7 +10379,7 @@
       </w:pPr>
       <w:r>
         <w:rPr>
-          <w:rStyle w:val="Cdigo-fonte"/>
+          <w:rStyle w:val="Cdigo-fonteuser"/>
         </w:rPr>
         <w:t>[\)\.\-\s]+</w:t>
       </w:r>
@@ -10676,7 +10415,7 @@
       </w:r>
       <w:r>
         <w:rPr>
-          <w:rStyle w:val="Cdigo-fonte"/>
+          <w:rStyle w:val="Cdigo-fonteuser"/>
         </w:rPr>
         <w:t xml:space="preserve">"a) </w:t>
       </w:r>
@@ -10686,7 +10425,7 @@
       </w:r>
       <w:r>
         <w:rPr>
-          <w:rStyle w:val="Cdigo-fonte"/>
+          <w:rStyle w:val="Cdigo-fonteuser"/>
         </w:rPr>
         <w:t>"</w:t>
       </w:r>
@@ -11027,7 +10766,7 @@
       </w:r>
       <w:r>
         <w:rPr>
-          <w:rStyle w:val="Cdigo-fonteuser"/>
+          <w:rStyle w:val="Cdigo-fonte"/>
         </w:rPr>
         <w:t>localStorage</w:t>
       </w:r>
@@ -11090,7 +10829,7 @@
     </w:p>
     <w:p>
       <w:pPr>
-        <w:pStyle w:val="Linhahorizontaluser"/>
+        <w:pStyle w:val="Linhahorizontal"/>
         <w:spacing w:before="0" w:after="160"/>
         <w:rPr>
           <w:sz w:val="24"/>
@@ -12252,7 +11991,7 @@
     </w:p>
     <w:p>
       <w:pPr>
-        <w:pStyle w:val="Linhahorizontal"/>
+        <w:pStyle w:val="Linhahorizontaluser"/>
         <w:spacing w:before="0" w:after="160"/>
         <w:rPr>
           <w:color w:val="000000"/>
@@ -12768,7 +12507,7 @@
       </w:pPr>
       <w:r>
         <w:rPr>
-          <w:rStyle w:val="Cdigo-fonteuser"/>
+          <w:rStyle w:val="Cdigo-fonte"/>
           <w:b/>
         </w:rPr>
         <w:t>duvid-db.js</w:t>
@@ -12779,7 +12518,7 @@
       </w:r>
       <w:r>
         <w:rPr>
-          <w:rStyle w:val="Cdigo-fonteuser"/>
+          <w:rStyle w:val="Cdigo-fonte"/>
         </w:rPr>
         <w:t>DuvidDB</w:t>
       </w:r>
@@ -12805,7 +12544,7 @@
       </w:pPr>
       <w:r>
         <w:rPr>
-          <w:rStyle w:val="Cdigo-fonteuser"/>
+          <w:rStyle w:val="Cdigo-fonte"/>
           <w:b/>
         </w:rPr>
         <w:t>duvid-ui.js</w:t>
@@ -12816,7 +12555,7 @@
       </w:r>
       <w:r>
         <w:rPr>
-          <w:rStyle w:val="Cdigo-fonteuser"/>
+          <w:rStyle w:val="Cdigo-fonte"/>
         </w:rPr>
         <w:t>atualizarInterface</w:t>
       </w:r>
@@ -12826,7 +12565,7 @@
       </w:r>
       <w:r>
         <w:rPr>
-          <w:rStyle w:val="Cdigo-fonteuser"/>
+          <w:rStyle w:val="Cdigo-fonte"/>
         </w:rPr>
         <w:t>dispararComemoracao</w:t>
       </w:r>
@@ -12836,7 +12575,7 @@
       </w:r>
       <w:r>
         <w:rPr>
-          <w:rStyle w:val="Cdigo-fonteuser"/>
+          <w:rStyle w:val="Cdigo-fonte"/>
         </w:rPr>
         <w:t>animarContador</w:t>
       </w:r>
@@ -12862,7 +12601,7 @@
       </w:pPr>
       <w:r>
         <w:rPr>
-          <w:rStyle w:val="Cdigo-fonteuser"/>
+          <w:rStyle w:val="Cdigo-fonte"/>
           <w:b/>
         </w:rPr>
         <w:t>duvid-audio.js</w:t>
@@ -12873,7 +12612,7 @@
       </w:r>
       <w:r>
         <w:rPr>
-          <w:rStyle w:val="Cdigo-fonteuser"/>
+          <w:rStyle w:val="Cdigo-fonte"/>
         </w:rPr>
         <w:t>playSom</w:t>
       </w:r>
@@ -19563,10 +19302,36 @@
       <w:u w:val="single"/>
     </w:rPr>
   </w:style>
+  <w:style w:type="character" w:styleId="Vnculodendiceuser">
+    <w:name w:val="Vínculo de índice (user)"/>
+    <w:qFormat/>
+    <w:rPr/>
+  </w:style>
+  <w:style w:type="character" w:styleId="Marcadoresuser">
+    <w:name w:val="Marcadores (user)"/>
+    <w:qFormat/>
+    <w:rPr>
+      <w:rFonts w:ascii="OpenSymbol" w:hAnsi="OpenSymbol" w:eastAsia="OpenSymbol" w:cs="OpenSymbol"/>
+    </w:rPr>
+  </w:style>
+  <w:style w:type="character" w:styleId="Cdigo-fonteuser">
+    <w:name w:val="Código-fonte (user)"/>
+    <w:qFormat/>
+    <w:rPr>
+      <w:rFonts w:ascii="Liberation Mono" w:hAnsi="Liberation Mono" w:eastAsia="Liberation Mono" w:cs="Liberation Mono"/>
+    </w:rPr>
+  </w:style>
   <w:style w:type="character" w:styleId="Vnculodendice">
     <w:name w:val="Vínculo de índice"/>
     <w:qFormat/>
     <w:rPr/>
+  </w:style>
+  <w:style w:type="character" w:styleId="Cdigo-fonte">
+    <w:name w:val="Código-fonte"/>
+    <w:qFormat/>
+    <w:rPr>
+      <w:rFonts w:ascii="Liberation Mono" w:hAnsi="Liberation Mono" w:eastAsia="Liberation Mono" w:cs="Liberation Mono"/>
+    </w:rPr>
   </w:style>
   <w:style w:type="character" w:styleId="Marcadores">
     <w:name w:val="Marcadores"/>
@@ -19575,39 +19340,13 @@
       <w:rFonts w:ascii="OpenSymbol" w:hAnsi="OpenSymbol" w:eastAsia="OpenSymbol" w:cs="OpenSymbol"/>
     </w:rPr>
   </w:style>
-  <w:style w:type="character" w:styleId="Cdigo-fonte">
-    <w:name w:val="Código-fonte"/>
-    <w:qFormat/>
-    <w:rPr>
-      <w:rFonts w:ascii="Liberation Mono" w:hAnsi="Liberation Mono" w:eastAsia="Liberation Mono" w:cs="Liberation Mono"/>
-    </w:rPr>
-  </w:style>
-  <w:style w:type="character" w:styleId="Vnculodendiceuser">
-    <w:name w:val="Vínculo de índice (user)"/>
+  <w:style w:type="character" w:styleId="Smbolosdenumeraouser">
+    <w:name w:val="Símbolos de numeração (user)"/>
     <w:qFormat/>
     <w:rPr/>
   </w:style>
-  <w:style w:type="character" w:styleId="Cdigo-fonteuser">
-    <w:name w:val="Código-fonte (user)"/>
-    <w:qFormat/>
-    <w:rPr>
-      <w:rFonts w:ascii="Liberation Mono" w:hAnsi="Liberation Mono" w:eastAsia="Liberation Mono" w:cs="Liberation Mono"/>
-    </w:rPr>
-  </w:style>
-  <w:style w:type="character" w:styleId="Marcadoresuser">
-    <w:name w:val="Marcadores (user)"/>
-    <w:qFormat/>
-    <w:rPr>
-      <w:rFonts w:ascii="OpenSymbol" w:hAnsi="OpenSymbol" w:eastAsia="OpenSymbol" w:cs="OpenSymbol"/>
-    </w:rPr>
-  </w:style>
   <w:style w:type="character" w:styleId="Smbolosdenumerao">
     <w:name w:val="Símbolos de numeração"/>
-    <w:qFormat/>
-    <w:rPr/>
-  </w:style>
-  <w:style w:type="character" w:styleId="Smbolosdenumeraouser">
-    <w:name w:val="Símbolos de numeração (user)"/>
     <w:qFormat/>
     <w:rPr/>
   </w:style>
@@ -19794,8 +19533,8 @@
       <w:color w:themeColor="accent1" w:themeShade="bf" w:val="0F4761"/>
     </w:rPr>
   </w:style>
-  <w:style w:type="paragraph" w:styleId="Cabealhoerodap">
-    <w:name w:val="Cabeçalho e rodapé"/>
+  <w:style w:type="paragraph" w:styleId="Cabealhoerodapuser">
+    <w:name w:val="Cabeçalho e rodapé (user)"/>
     <w:basedOn w:val="Normal"/>
     <w:qFormat/>
     <w:pPr>
@@ -19808,8 +19547,8 @@
     </w:pPr>
     <w:rPr/>
   </w:style>
-  <w:style w:type="paragraph" w:styleId="Cabealhoerodapuser">
-    <w:name w:val="Cabeçalho e rodapé (user)"/>
+  <w:style w:type="paragraph" w:styleId="Cabealhoerodap">
+    <w:name w:val="Cabeçalho e rodapé"/>
     <w:basedOn w:val="Normal"/>
     <w:qFormat/>
     <w:pPr/>
@@ -19817,7 +19556,7 @@
   </w:style>
   <w:style w:type="paragraph" w:styleId="Header">
     <w:name w:val="header"/>
-    <w:basedOn w:val="Cabealhoerodap"/>
+    <w:basedOn w:val="Cabealhoerodapuser"/>
     <w:pPr>
       <w:suppressLineNumbers/>
     </w:pPr>
@@ -19825,7 +19564,7 @@
   </w:style>
   <w:style w:type="paragraph" w:styleId="IndexHeading">
     <w:name w:val="index heading"/>
-    <w:basedOn w:val="Ttulo"/>
+    <w:basedOn w:val="Ttulouser"/>
     <w:pPr>
       <w:suppressLineNumbers/>
       <w:ind w:hanging="0" w:start="0"/>
@@ -19854,13 +19593,64 @@
   </w:style>
   <w:style w:type="paragraph" w:styleId="TOC1">
     <w:name w:val="toc 1"/>
-    <w:basedOn w:val="ndice"/>
+    <w:basedOn w:val="ndiceuser"/>
     <w:pPr>
       <w:tabs>
         <w:tab w:val="clear" w:pos="708"/>
         <w:tab w:val="right" w:pos="8504" w:leader="dot"/>
       </w:tabs>
       <w:ind w:hanging="0" w:start="0"/>
+    </w:pPr>
+    <w:rPr/>
+  </w:style>
+  <w:style w:type="paragraph" w:styleId="Linhahorizontaluser">
+    <w:name w:val="Linha horizontal (user)"/>
+    <w:basedOn w:val="Normal"/>
+    <w:next w:val="BodyText"/>
+    <w:qFormat/>
+    <w:pPr>
+      <w:suppressLineNumbers/>
+      <w:pBdr>
+        <w:bottom w:val="double" w:sz="2" w:space="0" w:color="808080"/>
+      </w:pBdr>
+      <w:spacing w:before="0" w:after="283"/>
+    </w:pPr>
+    <w:rPr>
+      <w:sz w:val="12"/>
+      <w:szCs w:val="12"/>
+    </w:rPr>
+  </w:style>
+  <w:style w:type="paragraph" w:styleId="Blocodecitaouser">
+    <w:name w:val="Bloco de citação (user)"/>
+    <w:basedOn w:val="Normal"/>
+    <w:qFormat/>
+    <w:pPr>
+      <w:spacing w:before="0" w:after="283"/>
+      <w:ind w:hanging="0" w:start="567" w:end="567"/>
+    </w:pPr>
+    <w:rPr/>
+  </w:style>
+  <w:style w:type="paragraph" w:styleId="TOC2">
+    <w:name w:val="toc 2"/>
+    <w:basedOn w:val="ndiceuser"/>
+    <w:pPr>
+      <w:tabs>
+        <w:tab w:val="clear" w:pos="708"/>
+        <w:tab w:val="right" w:pos="8221" w:leader="dot"/>
+      </w:tabs>
+      <w:ind w:hanging="0" w:start="283"/>
+    </w:pPr>
+    <w:rPr/>
+  </w:style>
+  <w:style w:type="paragraph" w:styleId="TOC3">
+    <w:name w:val="toc 3"/>
+    <w:basedOn w:val="ndiceuser"/>
+    <w:pPr>
+      <w:tabs>
+        <w:tab w:val="clear" w:pos="708"/>
+        <w:tab w:val="right" w:pos="7937" w:leader="dot"/>
+      </w:tabs>
+      <w:ind w:hanging="0" w:start="567"/>
     </w:pPr>
     <w:rPr/>
   </w:style>
@@ -19891,59 +19681,8 @@
     </w:pPr>
     <w:rPr/>
   </w:style>
-  <w:style w:type="paragraph" w:styleId="TOC2">
-    <w:name w:val="toc 2"/>
-    <w:basedOn w:val="ndice"/>
-    <w:pPr>
-      <w:tabs>
-        <w:tab w:val="clear" w:pos="708"/>
-        <w:tab w:val="right" w:pos="8221" w:leader="dot"/>
-      </w:tabs>
-      <w:ind w:hanging="0" w:start="283"/>
-    </w:pPr>
-    <w:rPr/>
-  </w:style>
-  <w:style w:type="paragraph" w:styleId="TOC3">
-    <w:name w:val="toc 3"/>
-    <w:basedOn w:val="ndice"/>
-    <w:pPr>
-      <w:tabs>
-        <w:tab w:val="clear" w:pos="708"/>
-        <w:tab w:val="right" w:pos="7937" w:leader="dot"/>
-      </w:tabs>
-      <w:ind w:hanging="0" w:start="567"/>
-    </w:pPr>
-    <w:rPr/>
-  </w:style>
-  <w:style w:type="paragraph" w:styleId="Linhahorizontaluser">
-    <w:name w:val="Linha horizontal (user)"/>
-    <w:basedOn w:val="Normal"/>
-    <w:next w:val="BodyText"/>
-    <w:qFormat/>
-    <w:pPr>
-      <w:suppressLineNumbers/>
-      <w:pBdr>
-        <w:bottom w:val="double" w:sz="2" w:space="0" w:color="808080"/>
-      </w:pBdr>
-      <w:spacing w:before="0" w:after="283"/>
-    </w:pPr>
-    <w:rPr>
-      <w:sz w:val="12"/>
-      <w:szCs w:val="12"/>
-    </w:rPr>
-  </w:style>
-  <w:style w:type="paragraph" w:styleId="Blocodecitaouser">
-    <w:name w:val="Bloco de citação (user)"/>
-    <w:basedOn w:val="Normal"/>
-    <w:qFormat/>
-    <w:pPr>
-      <w:spacing w:before="0" w:after="283"/>
-      <w:ind w:hanging="0" w:start="567" w:end="567"/>
-    </w:pPr>
-    <w:rPr/>
-  </w:style>
-  <w:style w:type="paragraph" w:styleId="Contedodatabela">
-    <w:name w:val="Conteúdo da tabela"/>
+  <w:style w:type="paragraph" w:styleId="Contedodatabelauser">
+    <w:name w:val="Conteúdo da tabela (user)"/>
     <w:basedOn w:val="Normal"/>
     <w:qFormat/>
     <w:pPr>
@@ -19952,9 +19691,9 @@
     </w:pPr>
     <w:rPr/>
   </w:style>
-  <w:style w:type="paragraph" w:styleId="Ttulodetabela">
-    <w:name w:val="Título de tabela"/>
-    <w:basedOn w:val="Contedodatabela"/>
+  <w:style w:type="paragraph" w:styleId="Ttulodetabelauser">
+    <w:name w:val="Título de tabela (user)"/>
+    <w:basedOn w:val="Contedodatabelauser"/>
     <w:qFormat/>
     <w:pPr>
       <w:suppressLineNumbers/>
@@ -19965,15 +19704,15 @@
       <w:bCs/>
     </w:rPr>
   </w:style>
-  <w:style w:type="paragraph" w:styleId="Contedodoquadrouser">
-    <w:name w:val="Conteúdo do quadro (user)"/>
+  <w:style w:type="paragraph" w:styleId="Contedodoquadro">
+    <w:name w:val="Conteúdo do quadro"/>
     <w:basedOn w:val="Normal"/>
     <w:qFormat/>
     <w:pPr/>
     <w:rPr/>
   </w:style>
-  <w:style w:type="numbering" w:styleId="Semlista" w:default="1">
-    <w:name w:val="Sem lista"/>
+  <w:style w:type="numbering" w:styleId="Semlistauser" w:default="1">
+    <w:name w:val="Sem lista (user)"/>
     <w:uiPriority w:val="99"/>
     <w:semiHidden/>
     <w:unhideWhenUsed/>

</xml_diff>